<commit_message>
TS 2.3 2.4 Ghanam and Jatai
</commit_message>
<xml_diff>
--- a/TS Jatai Ghanam Project/TS 2.3/TS 2.3 Jatai Tamil Corrections.docx
+++ b/TS Jatai Ghanam Project/TS 2.3/TS 2.3 Jatai Tamil Corrections.docx
@@ -50,10 +50,9 @@
           <w:bCs/>
           <w:sz w:val="32"/>
           <w:szCs w:val="32"/>
-          <w:highlight w:val="red"/>
           <w:u w:val="single"/>
         </w:rPr>
-        <w:t>?????</w:t>
+        <w:t>31st July 2026</w:t>
       </w:r>
     </w:p>
     <w:p>
@@ -156,6 +155,873 @@
       </w:tr>
       <w:tr>
         <w:trPr>
+          <w:trHeight w:val="1405"/>
+        </w:trPr>
+        <w:tc>
+          <w:tcPr>
+            <w:tcW w:w="7166" w:type="dxa"/>
+          </w:tcPr>
+          <w:p>
+            <w:pPr>
+              <w:autoSpaceDE w:val="0"/>
+              <w:autoSpaceDN w:val="0"/>
+              <w:adjustRightInd w:val="0"/>
+              <w:rPr>
+                <w:rFonts w:ascii="Latha" w:hAnsi="Latha" w:cs="Latha"/>
+                <w:szCs w:val="24"/>
+                <w:lang w:bidi="ta-IN"/>
+              </w:rPr>
+            </w:pPr>
+            <w:r>
+              <w:rPr>
+                <w:rFonts w:ascii="Latha" w:hAnsi="Latha" w:cs="Latha"/>
+                <w:b/>
+                <w:bCs/>
+                <w:szCs w:val="24"/>
+                <w:cs/>
+                <w:lang w:bidi="ta-IN"/>
+              </w:rPr>
+              <w:t>65</w:t>
+            </w:r>
+            <w:r>
+              <w:rPr>
+                <w:rFonts w:ascii="Latha" w:hAnsi="Latha" w:cs="Latha"/>
+                <w:b/>
+                <w:bCs/>
+                <w:szCs w:val="24"/>
+                <w:lang w:bidi="ta-IN"/>
+              </w:rPr>
+              <w:t>)</w:t>
+            </w:r>
+            <w:r>
+              <w:rPr>
+                <w:rFonts w:ascii="Latha" w:hAnsi="Latha" w:cs="Latha"/>
+                <w:szCs w:val="24"/>
+                <w:lang w:bidi="ta-IN"/>
+              </w:rPr>
+              <w:tab/>
+            </w:r>
+            <w:r>
+              <w:rPr>
+                <w:rFonts w:ascii="Latha" w:hAnsi="Latha" w:cs="Latha"/>
+                <w:b/>
+                <w:bCs/>
+                <w:szCs w:val="24"/>
+                <w:cs/>
+                <w:lang w:bidi="ta-IN"/>
+              </w:rPr>
+              <w:t>2.3</w:t>
+            </w:r>
+            <w:r>
+              <w:rPr>
+                <w:rFonts w:ascii="Latha" w:hAnsi="Latha" w:cs="Latha"/>
+                <w:b/>
+                <w:bCs/>
+                <w:szCs w:val="24"/>
+                <w:lang w:bidi="ta-IN"/>
+              </w:rPr>
+              <w:t>.</w:t>
+            </w:r>
+            <w:r>
+              <w:rPr>
+                <w:rFonts w:ascii="Latha" w:hAnsi="Latha" w:cs="Latha"/>
+                <w:b/>
+                <w:bCs/>
+                <w:szCs w:val="24"/>
+                <w:cs/>
+                <w:lang w:bidi="ta-IN"/>
+              </w:rPr>
+              <w:t>5</w:t>
+            </w:r>
+            <w:r>
+              <w:rPr>
+                <w:rFonts w:ascii="Latha" w:hAnsi="Latha" w:cs="Latha"/>
+                <w:b/>
+                <w:bCs/>
+                <w:szCs w:val="24"/>
+                <w:lang w:bidi="ta-IN"/>
+              </w:rPr>
+              <w:t>.3</w:t>
+            </w:r>
+            <w:r>
+              <w:rPr>
+                <w:rFonts w:ascii="Latha" w:hAnsi="Latha" w:cs="Latha"/>
+                <w:b/>
+                <w:bCs/>
+                <w:szCs w:val="24"/>
+                <w:lang w:bidi="ta-IN"/>
+              </w:rPr>
+              <w:t>(</w:t>
+            </w:r>
+            <w:r>
+              <w:rPr>
+                <w:rFonts w:ascii="Latha" w:hAnsi="Latha" w:cs="Latha"/>
+                <w:b/>
+                <w:bCs/>
+                <w:szCs w:val="24"/>
+                <w:cs/>
+                <w:lang w:bidi="ta-IN"/>
+              </w:rPr>
+              <w:t>58</w:t>
+            </w:r>
+            <w:r>
+              <w:rPr>
+                <w:rFonts w:ascii="Latha" w:hAnsi="Latha" w:cs="Latha"/>
+                <w:b/>
+                <w:bCs/>
+                <w:szCs w:val="24"/>
+                <w:lang w:bidi="ta-IN"/>
+              </w:rPr>
+              <w:t>)</w:t>
+            </w:r>
+            <w:r>
+              <w:rPr>
+                <w:rFonts w:ascii="Latha" w:hAnsi="Latha" w:cs="Latha"/>
+                <w:szCs w:val="24"/>
+                <w:lang w:bidi="ta-IN"/>
+              </w:rPr>
+              <w:t xml:space="preserve">-  </w:t>
+            </w:r>
+            <w:r>
+              <w:rPr>
+                <w:rFonts w:ascii="Latha" w:hAnsi="Latha" w:cs="Latha"/>
+                <w:szCs w:val="24"/>
+                <w:cs/>
+                <w:lang w:bidi="ta-IN"/>
+              </w:rPr>
+              <w:t>யா</w:t>
+            </w:r>
+            <w:r>
+              <w:rPr>
+                <w:rFonts w:ascii="BRH Tamil Tab Extra" w:hAnsi="BRH Tamil Tab Extra" w:cs="Latha"/>
+                <w:b/>
+                <w:bCs/>
+                <w:szCs w:val="28"/>
+                <w:lang w:bidi="ta-IN"/>
+              </w:rPr>
+              <w:t>…</w:t>
+            </w:r>
+            <w:r>
+              <w:rPr>
+                <w:rFonts w:ascii="Latha" w:hAnsi="Latha" w:cs="Latha"/>
+                <w:szCs w:val="24"/>
+                <w:cs/>
+                <w:lang w:bidi="ta-IN"/>
+              </w:rPr>
+              <w:t>ஜ்யா</w:t>
+            </w:r>
+            <w:r>
+              <w:rPr>
+                <w:rFonts w:ascii="BRH Tamil Tab Extra" w:hAnsi="BRH Tamil Tab Extra" w:cs="Latha"/>
+                <w:b/>
+                <w:bCs/>
+                <w:szCs w:val="28"/>
+                <w:lang w:bidi="ta-IN"/>
+              </w:rPr>
+              <w:t>‡</w:t>
+            </w:r>
+            <w:r>
+              <w:rPr>
+                <w:rFonts w:ascii="Latha" w:hAnsi="Latha" w:cs="Latha"/>
+                <w:szCs w:val="24"/>
+                <w:lang w:bidi="ta-IN"/>
+              </w:rPr>
+              <w:t xml:space="preserve"> | </w:t>
+            </w:r>
+            <w:r>
+              <w:rPr>
+                <w:rFonts w:ascii="Latha" w:hAnsi="Latha" w:cs="Latha"/>
+                <w:szCs w:val="24"/>
+                <w:cs/>
+                <w:lang w:bidi="ta-IN"/>
+              </w:rPr>
+              <w:t xml:space="preserve">ஆ </w:t>
+            </w:r>
+            <w:r>
+              <w:rPr>
+                <w:rFonts w:ascii="Latha" w:hAnsi="Latha" w:cs="Latha"/>
+                <w:szCs w:val="24"/>
+                <w:lang w:bidi="ta-IN"/>
+              </w:rPr>
+              <w:t xml:space="preserve">| </w:t>
+            </w:r>
+            <w:r>
+              <w:rPr>
+                <w:rFonts w:ascii="Latha" w:hAnsi="Latha" w:cs="Latha"/>
+                <w:b/>
+                <w:bCs/>
+                <w:szCs w:val="24"/>
+                <w:lang w:bidi="ta-IN"/>
+              </w:rPr>
+              <w:t>(</w:t>
+            </w:r>
+            <w:r>
+              <w:rPr>
+                <w:rFonts w:ascii="Latha" w:hAnsi="Latha" w:cs="Latha"/>
+                <w:b/>
+                <w:bCs/>
+                <w:szCs w:val="24"/>
+                <w:lang w:bidi="ta-IN"/>
+              </w:rPr>
+              <w:t>GS</w:t>
+            </w:r>
+            <w:r>
+              <w:rPr>
+                <w:rFonts w:ascii="Latha" w:hAnsi="Latha" w:cs="Latha"/>
+                <w:szCs w:val="24"/>
+                <w:lang w:bidi="ta-IN"/>
+              </w:rPr>
+              <w:t>-</w:t>
+            </w:r>
+            <w:r>
+              <w:rPr>
+                <w:rFonts w:ascii="Latha" w:hAnsi="Latha" w:cs="Latha"/>
+                <w:b/>
+                <w:bCs/>
+                <w:szCs w:val="24"/>
+                <w:cs/>
+                <w:lang w:bidi="ta-IN"/>
+              </w:rPr>
+              <w:t>2.3</w:t>
+            </w:r>
+            <w:r>
+              <w:rPr>
+                <w:rFonts w:ascii="Latha" w:hAnsi="Latha" w:cs="Latha"/>
+                <w:szCs w:val="24"/>
+                <w:lang w:bidi="ta-IN"/>
+              </w:rPr>
+              <w:t>-</w:t>
+            </w:r>
+            <w:r>
+              <w:rPr>
+                <w:rFonts w:ascii="Latha" w:hAnsi="Latha" w:cs="Latha"/>
+                <w:b/>
+                <w:bCs/>
+                <w:szCs w:val="24"/>
+                <w:cs/>
+                <w:lang w:bidi="ta-IN"/>
+              </w:rPr>
+              <w:t>20</w:t>
+            </w:r>
+            <w:r>
+              <w:rPr>
+                <w:rFonts w:ascii="Latha" w:hAnsi="Latha" w:cs="Latha"/>
+                <w:b/>
+                <w:bCs/>
+                <w:szCs w:val="24"/>
+                <w:lang w:bidi="ta-IN"/>
+              </w:rPr>
+              <w:t>)</w:t>
+            </w:r>
+          </w:p>
+          <w:p>
+            <w:pPr>
+              <w:widowControl w:val="0"/>
+              <w:autoSpaceDE w:val="0"/>
+              <w:autoSpaceDN w:val="0"/>
+              <w:adjustRightInd w:val="0"/>
+              <w:spacing w:before="0" w:line="240" w:lineRule="auto"/>
+              <w:rPr>
+                <w:rFonts w:cs="BRH Malayalam Extra"/>
+                <w:color w:val="000000"/>
+                <w:szCs w:val="40"/>
+              </w:rPr>
+            </w:pPr>
+            <w:r>
+              <w:rPr>
+                <w:rFonts w:ascii="Latha" w:hAnsi="Latha" w:cs="Latha"/>
+                <w:szCs w:val="24"/>
+                <w:cs/>
+                <w:lang w:bidi="ta-IN"/>
+              </w:rPr>
+              <w:t>யா</w:t>
+            </w:r>
+            <w:r>
+              <w:rPr>
+                <w:rFonts w:ascii="BRH Tamil Tab Extra" w:hAnsi="BRH Tamil Tab Extra" w:cs="Latha"/>
+                <w:b/>
+                <w:bCs/>
+                <w:szCs w:val="28"/>
+                <w:lang w:bidi="ta-IN"/>
+              </w:rPr>
+              <w:t>…</w:t>
+            </w:r>
+            <w:r>
+              <w:rPr>
+                <w:rFonts w:ascii="Latha" w:hAnsi="Latha" w:cs="Latha"/>
+                <w:szCs w:val="24"/>
+                <w:cs/>
+                <w:lang w:bidi="ta-IN"/>
+              </w:rPr>
+              <w:t>ஜ்</w:t>
+            </w:r>
+            <w:r>
+              <w:rPr>
+                <w:rFonts w:ascii="Latha" w:hAnsi="Latha" w:cs="Latha"/>
+                <w:szCs w:val="24"/>
+                <w:highlight w:val="yellow"/>
+                <w:cs/>
+                <w:lang w:bidi="ta-IN"/>
+              </w:rPr>
+              <w:t>யா</w:t>
+            </w:r>
+            <w:r>
+              <w:rPr>
+                <w:rFonts w:ascii="BRH Tamil Tab Extra" w:hAnsi="BRH Tamil Tab Extra" w:cs="Latha"/>
+                <w:b/>
+                <w:bCs/>
+                <w:szCs w:val="28"/>
+                <w:highlight w:val="yellow"/>
+                <w:lang w:bidi="ta-IN"/>
+              </w:rPr>
+              <w:t>†</w:t>
+            </w:r>
+            <w:r>
+              <w:rPr>
+                <w:rFonts w:ascii="Latha" w:hAnsi="Latha" w:cs="Latha"/>
+                <w:szCs w:val="24"/>
+                <w:lang w:bidi="ta-IN"/>
+              </w:rPr>
+              <w:t xml:space="preserve"> </w:t>
+            </w:r>
+            <w:r>
+              <w:rPr>
+                <w:rFonts w:ascii="BRH Devanagari Extra" w:hAnsi="BRH Devanagari Extra" w:cs="Latha"/>
+                <w:b/>
+                <w:bCs/>
+                <w:szCs w:val="28"/>
+                <w:lang w:bidi="ta-IN"/>
+              </w:rPr>
+              <w:t>ÅÅ</w:t>
+            </w:r>
+            <w:r>
+              <w:rPr>
+                <w:rFonts w:ascii="Latha" w:hAnsi="Latha" w:cs="Latha"/>
+                <w:szCs w:val="24"/>
+                <w:cs/>
+                <w:lang w:bidi="ta-IN"/>
+              </w:rPr>
+              <w:t>யா</w:t>
+            </w:r>
+            <w:r>
+              <w:rPr>
+                <w:rFonts w:ascii="BRH Tamil Tab Extra" w:hAnsi="BRH Tamil Tab Extra" w:cs="Latha"/>
+                <w:b/>
+                <w:bCs/>
+                <w:szCs w:val="28"/>
+                <w:lang w:bidi="ta-IN"/>
+              </w:rPr>
+              <w:t>…</w:t>
+            </w:r>
+            <w:r>
+              <w:rPr>
+                <w:rFonts w:ascii="Latha" w:hAnsi="Latha" w:cs="Latha"/>
+                <w:szCs w:val="24"/>
+                <w:cs/>
+                <w:lang w:bidi="ta-IN"/>
+              </w:rPr>
+              <w:t>ஜ்யா</w:t>
+            </w:r>
+            <w:r>
+              <w:rPr>
+                <w:rFonts w:ascii="BRH Tamil Tab Extra" w:hAnsi="BRH Tamil Tab Extra" w:cs="Latha"/>
+                <w:b/>
+                <w:bCs/>
+                <w:szCs w:val="28"/>
+                <w:lang w:bidi="ta-IN"/>
+              </w:rPr>
+              <w:t>†</w:t>
+            </w:r>
+            <w:r>
+              <w:rPr>
+                <w:rFonts w:ascii="Latha" w:hAnsi="Latha" w:cs="Latha"/>
+                <w:szCs w:val="24"/>
+                <w:lang w:bidi="ta-IN"/>
+              </w:rPr>
+              <w:t xml:space="preserve"> </w:t>
+            </w:r>
+            <w:r>
+              <w:rPr>
+                <w:rFonts w:ascii="Latha" w:hAnsi="Latha" w:cs="Latha"/>
+                <w:szCs w:val="24"/>
+                <w:cs/>
+                <w:lang w:bidi="ta-IN"/>
+              </w:rPr>
+              <w:t>யா</w:t>
+            </w:r>
+            <w:r>
+              <w:rPr>
+                <w:rFonts w:ascii="BRH Tamil Tab Extra" w:hAnsi="BRH Tamil Tab Extra" w:cs="Latha"/>
+                <w:b/>
+                <w:bCs/>
+                <w:szCs w:val="28"/>
+                <w:lang w:bidi="ta-IN"/>
+              </w:rPr>
+              <w:t>…</w:t>
+            </w:r>
+            <w:r>
+              <w:rPr>
+                <w:rFonts w:ascii="Latha" w:hAnsi="Latha" w:cs="Latha"/>
+                <w:szCs w:val="24"/>
+                <w:cs/>
+                <w:lang w:bidi="ta-IN"/>
+              </w:rPr>
+              <w:t>ஜ்</w:t>
+            </w:r>
+            <w:r>
+              <w:rPr>
+                <w:rFonts w:ascii="Latha" w:hAnsi="Latha" w:cs="Latha"/>
+                <w:szCs w:val="24"/>
+                <w:highlight w:val="yellow"/>
+                <w:cs/>
+                <w:lang w:bidi="ta-IN"/>
+              </w:rPr>
+              <w:t>யா</w:t>
+            </w:r>
+            <w:r>
+              <w:rPr>
+                <w:rFonts w:ascii="BRH Tamil Tab Extra" w:hAnsi="BRH Tamil Tab Extra" w:cs="Latha"/>
+                <w:b/>
+                <w:bCs/>
+                <w:szCs w:val="28"/>
+                <w:highlight w:val="yellow"/>
+                <w:lang w:bidi="ta-IN"/>
+              </w:rPr>
+              <w:t>‡</w:t>
+            </w:r>
+            <w:r>
+              <w:rPr>
+                <w:rFonts w:ascii="Latha" w:hAnsi="Latha" w:cs="Latha"/>
+                <w:szCs w:val="24"/>
+                <w:lang w:bidi="ta-IN"/>
+              </w:rPr>
+              <w:t xml:space="preserve"> |</w:t>
+            </w:r>
+          </w:p>
+        </w:tc>
+        <w:tc>
+          <w:tcPr>
+            <w:tcW w:w="7371" w:type="dxa"/>
+          </w:tcPr>
+          <w:p>
+            <w:pPr>
+              <w:autoSpaceDE w:val="0"/>
+              <w:autoSpaceDN w:val="0"/>
+              <w:adjustRightInd w:val="0"/>
+              <w:rPr>
+                <w:rFonts w:ascii="Latha" w:hAnsi="Latha" w:cs="Latha"/>
+                <w:szCs w:val="24"/>
+                <w:lang w:bidi="ta-IN"/>
+              </w:rPr>
+            </w:pPr>
+            <w:r>
+              <w:rPr>
+                <w:rFonts w:ascii="Latha" w:hAnsi="Latha" w:cs="Latha"/>
+                <w:b/>
+                <w:bCs/>
+                <w:szCs w:val="24"/>
+                <w:cs/>
+                <w:lang w:bidi="ta-IN"/>
+              </w:rPr>
+              <w:t>65</w:t>
+            </w:r>
+            <w:r>
+              <w:rPr>
+                <w:rFonts w:ascii="Latha" w:hAnsi="Latha" w:cs="Latha"/>
+                <w:b/>
+                <w:bCs/>
+                <w:szCs w:val="24"/>
+                <w:lang w:bidi="ta-IN"/>
+              </w:rPr>
+              <w:t>)</w:t>
+            </w:r>
+            <w:r>
+              <w:rPr>
+                <w:rFonts w:ascii="Latha" w:hAnsi="Latha" w:cs="Latha"/>
+                <w:szCs w:val="24"/>
+                <w:lang w:bidi="ta-IN"/>
+              </w:rPr>
+              <w:tab/>
+            </w:r>
+            <w:r>
+              <w:rPr>
+                <w:rFonts w:ascii="Latha" w:hAnsi="Latha" w:cs="Latha"/>
+                <w:b/>
+                <w:bCs/>
+                <w:szCs w:val="24"/>
+                <w:cs/>
+                <w:lang w:bidi="ta-IN"/>
+              </w:rPr>
+              <w:t>2.3</w:t>
+            </w:r>
+            <w:r>
+              <w:rPr>
+                <w:rFonts w:ascii="Latha" w:hAnsi="Latha" w:cs="Latha"/>
+                <w:b/>
+                <w:bCs/>
+                <w:szCs w:val="24"/>
+                <w:lang w:bidi="ta-IN"/>
+              </w:rPr>
+              <w:t>.</w:t>
+            </w:r>
+            <w:r>
+              <w:rPr>
+                <w:rFonts w:ascii="Latha" w:hAnsi="Latha" w:cs="Latha"/>
+                <w:b/>
+                <w:bCs/>
+                <w:szCs w:val="24"/>
+                <w:cs/>
+                <w:lang w:bidi="ta-IN"/>
+              </w:rPr>
+              <w:t>5</w:t>
+            </w:r>
+            <w:r>
+              <w:rPr>
+                <w:rFonts w:ascii="Latha" w:hAnsi="Latha" w:cs="Latha"/>
+                <w:b/>
+                <w:bCs/>
+                <w:szCs w:val="24"/>
+                <w:lang w:bidi="ta-IN"/>
+              </w:rPr>
+              <w:t>.3</w:t>
+            </w:r>
+            <w:r>
+              <w:rPr>
+                <w:rFonts w:ascii="Latha" w:hAnsi="Latha" w:cs="Latha"/>
+                <w:b/>
+                <w:bCs/>
+                <w:szCs w:val="24"/>
+                <w:lang w:bidi="ta-IN"/>
+              </w:rPr>
+              <w:t>(</w:t>
+            </w:r>
+            <w:r>
+              <w:rPr>
+                <w:rFonts w:ascii="Latha" w:hAnsi="Latha" w:cs="Latha"/>
+                <w:b/>
+                <w:bCs/>
+                <w:szCs w:val="24"/>
+                <w:cs/>
+                <w:lang w:bidi="ta-IN"/>
+              </w:rPr>
+              <w:t>58</w:t>
+            </w:r>
+            <w:r>
+              <w:rPr>
+                <w:rFonts w:ascii="Latha" w:hAnsi="Latha" w:cs="Latha"/>
+                <w:b/>
+                <w:bCs/>
+                <w:szCs w:val="24"/>
+                <w:lang w:bidi="ta-IN"/>
+              </w:rPr>
+              <w:t>)</w:t>
+            </w:r>
+            <w:r>
+              <w:rPr>
+                <w:rFonts w:ascii="Latha" w:hAnsi="Latha" w:cs="Latha"/>
+                <w:szCs w:val="24"/>
+                <w:lang w:bidi="ta-IN"/>
+              </w:rPr>
+              <w:t xml:space="preserve">-  </w:t>
+            </w:r>
+            <w:r>
+              <w:rPr>
+                <w:rFonts w:ascii="Latha" w:hAnsi="Latha" w:cs="Latha"/>
+                <w:szCs w:val="24"/>
+                <w:cs/>
+                <w:lang w:bidi="ta-IN"/>
+              </w:rPr>
+              <w:t>யா</w:t>
+            </w:r>
+            <w:r>
+              <w:rPr>
+                <w:rFonts w:ascii="BRH Tamil Tab Extra" w:hAnsi="BRH Tamil Tab Extra" w:cs="Latha"/>
+                <w:b/>
+                <w:bCs/>
+                <w:szCs w:val="28"/>
+                <w:lang w:bidi="ta-IN"/>
+              </w:rPr>
+              <w:t>…</w:t>
+            </w:r>
+            <w:r>
+              <w:rPr>
+                <w:rFonts w:ascii="Latha" w:hAnsi="Latha" w:cs="Latha"/>
+                <w:szCs w:val="24"/>
+                <w:cs/>
+                <w:lang w:bidi="ta-IN"/>
+              </w:rPr>
+              <w:t>ஜ்யா</w:t>
+            </w:r>
+            <w:r>
+              <w:rPr>
+                <w:rFonts w:ascii="BRH Tamil Tab Extra" w:hAnsi="BRH Tamil Tab Extra" w:cs="Latha"/>
+                <w:b/>
+                <w:bCs/>
+                <w:szCs w:val="28"/>
+                <w:lang w:bidi="ta-IN"/>
+              </w:rPr>
+              <w:t>‡</w:t>
+            </w:r>
+            <w:r>
+              <w:rPr>
+                <w:rFonts w:ascii="Latha" w:hAnsi="Latha" w:cs="Latha"/>
+                <w:szCs w:val="24"/>
+                <w:lang w:bidi="ta-IN"/>
+              </w:rPr>
+              <w:t xml:space="preserve"> | </w:t>
+            </w:r>
+            <w:r>
+              <w:rPr>
+                <w:rFonts w:ascii="Latha" w:hAnsi="Latha" w:cs="Latha"/>
+                <w:szCs w:val="24"/>
+                <w:cs/>
+                <w:lang w:bidi="ta-IN"/>
+              </w:rPr>
+              <w:t xml:space="preserve">ஆ </w:t>
+            </w:r>
+            <w:r>
+              <w:rPr>
+                <w:rFonts w:ascii="Latha" w:hAnsi="Latha" w:cs="Latha"/>
+                <w:szCs w:val="24"/>
+                <w:lang w:bidi="ta-IN"/>
+              </w:rPr>
+              <w:t xml:space="preserve">| </w:t>
+            </w:r>
+            <w:r>
+              <w:rPr>
+                <w:rFonts w:ascii="Latha" w:hAnsi="Latha" w:cs="Latha"/>
+                <w:b/>
+                <w:bCs/>
+                <w:szCs w:val="24"/>
+                <w:lang w:bidi="ta-IN"/>
+              </w:rPr>
+              <w:t>(</w:t>
+            </w:r>
+            <w:r>
+              <w:rPr>
+                <w:rFonts w:ascii="Latha" w:hAnsi="Latha" w:cs="Latha"/>
+                <w:b/>
+                <w:bCs/>
+                <w:szCs w:val="24"/>
+                <w:lang w:bidi="ta-IN"/>
+              </w:rPr>
+              <w:t>GS</w:t>
+            </w:r>
+            <w:r>
+              <w:rPr>
+                <w:rFonts w:ascii="Latha" w:hAnsi="Latha" w:cs="Latha"/>
+                <w:szCs w:val="24"/>
+                <w:lang w:bidi="ta-IN"/>
+              </w:rPr>
+              <w:t>-</w:t>
+            </w:r>
+            <w:r>
+              <w:rPr>
+                <w:rFonts w:ascii="Latha" w:hAnsi="Latha" w:cs="Latha"/>
+                <w:b/>
+                <w:bCs/>
+                <w:szCs w:val="24"/>
+                <w:cs/>
+                <w:lang w:bidi="ta-IN"/>
+              </w:rPr>
+              <w:t>2.3</w:t>
+            </w:r>
+            <w:r>
+              <w:rPr>
+                <w:rFonts w:ascii="Latha" w:hAnsi="Latha" w:cs="Latha"/>
+                <w:szCs w:val="24"/>
+                <w:lang w:bidi="ta-IN"/>
+              </w:rPr>
+              <w:t>-</w:t>
+            </w:r>
+            <w:r>
+              <w:rPr>
+                <w:rFonts w:ascii="Latha" w:hAnsi="Latha" w:cs="Latha"/>
+                <w:b/>
+                <w:bCs/>
+                <w:szCs w:val="24"/>
+                <w:cs/>
+                <w:lang w:bidi="ta-IN"/>
+              </w:rPr>
+              <w:t>20</w:t>
+            </w:r>
+            <w:r>
+              <w:rPr>
+                <w:rFonts w:ascii="Latha" w:hAnsi="Latha" w:cs="Latha"/>
+                <w:b/>
+                <w:bCs/>
+                <w:szCs w:val="24"/>
+                <w:lang w:bidi="ta-IN"/>
+              </w:rPr>
+              <w:t>)</w:t>
+            </w:r>
+          </w:p>
+          <w:p>
+            <w:pPr>
+              <w:widowControl w:val="0"/>
+              <w:autoSpaceDE w:val="0"/>
+              <w:autoSpaceDN w:val="0"/>
+              <w:adjustRightInd w:val="0"/>
+              <w:spacing w:before="0" w:line="240" w:lineRule="auto"/>
+              <w:rPr>
+                <w:rFonts w:cs="BRH Malayalam Extra"/>
+                <w:color w:val="000000"/>
+                <w:szCs w:val="40"/>
+              </w:rPr>
+            </w:pPr>
+            <w:r>
+              <w:rPr>
+                <w:rFonts w:ascii="Latha" w:hAnsi="Latha" w:cs="Latha"/>
+                <w:szCs w:val="24"/>
+                <w:cs/>
+                <w:lang w:bidi="ta-IN"/>
+              </w:rPr>
+              <w:t>யா</w:t>
+            </w:r>
+            <w:r>
+              <w:rPr>
+                <w:rFonts w:ascii="BRH Tamil Tab Extra" w:hAnsi="BRH Tamil Tab Extra" w:cs="Latha"/>
+                <w:b/>
+                <w:bCs/>
+                <w:szCs w:val="28"/>
+                <w:lang w:bidi="ta-IN"/>
+              </w:rPr>
+              <w:t>…</w:t>
+            </w:r>
+            <w:r>
+              <w:rPr>
+                <w:rFonts w:ascii="Latha" w:hAnsi="Latha" w:cs="Latha"/>
+                <w:szCs w:val="24"/>
+                <w:cs/>
+                <w:lang w:bidi="ta-IN"/>
+              </w:rPr>
+              <w:t>ஜ்</w:t>
+            </w:r>
+            <w:r>
+              <w:rPr>
+                <w:rFonts w:ascii="Latha" w:hAnsi="Latha" w:cs="Latha"/>
+                <w:szCs w:val="24"/>
+                <w:highlight w:val="green"/>
+                <w:cs/>
+                <w:lang w:bidi="ta-IN"/>
+              </w:rPr>
+              <w:t>யா</w:t>
+            </w:r>
+            <w:r>
+              <w:rPr>
+                <w:rFonts w:ascii="Latha" w:hAnsi="Latha" w:cs="Latha"/>
+                <w:szCs w:val="24"/>
+                <w:lang w:bidi="ta-IN"/>
+              </w:rPr>
+              <w:t xml:space="preserve"> </w:t>
+            </w:r>
+            <w:r>
+              <w:rPr>
+                <w:rFonts w:ascii="BRH Devanagari Extra" w:hAnsi="BRH Devanagari Extra" w:cs="Latha"/>
+                <w:b/>
+                <w:bCs/>
+                <w:szCs w:val="28"/>
+                <w:lang w:bidi="ta-IN"/>
+              </w:rPr>
+              <w:t>ÅÅ</w:t>
+            </w:r>
+            <w:r>
+              <w:rPr>
+                <w:rFonts w:ascii="Latha" w:hAnsi="Latha" w:cs="Latha"/>
+                <w:szCs w:val="24"/>
+                <w:cs/>
+                <w:lang w:bidi="ta-IN"/>
+              </w:rPr>
+              <w:t>யா</w:t>
+            </w:r>
+            <w:r>
+              <w:rPr>
+                <w:rFonts w:ascii="BRH Tamil Tab Extra" w:hAnsi="BRH Tamil Tab Extra" w:cs="Latha"/>
+                <w:b/>
+                <w:bCs/>
+                <w:szCs w:val="28"/>
+                <w:lang w:bidi="ta-IN"/>
+              </w:rPr>
+              <w:t>…</w:t>
+            </w:r>
+            <w:r>
+              <w:rPr>
+                <w:rFonts w:ascii="Latha" w:hAnsi="Latha" w:cs="Latha"/>
+                <w:szCs w:val="24"/>
+                <w:cs/>
+                <w:lang w:bidi="ta-IN"/>
+              </w:rPr>
+              <w:t>ஜ்யா</w:t>
+            </w:r>
+            <w:r>
+              <w:rPr>
+                <w:rFonts w:ascii="BRH Tamil Tab Extra" w:hAnsi="BRH Tamil Tab Extra" w:cs="Latha"/>
+                <w:b/>
+                <w:bCs/>
+                <w:szCs w:val="28"/>
+                <w:lang w:bidi="ta-IN"/>
+              </w:rPr>
+              <w:t>†</w:t>
+            </w:r>
+            <w:r>
+              <w:rPr>
+                <w:rFonts w:ascii="Latha" w:hAnsi="Latha" w:cs="Latha"/>
+                <w:szCs w:val="24"/>
+                <w:lang w:bidi="ta-IN"/>
+              </w:rPr>
+              <w:t xml:space="preserve"> </w:t>
+            </w:r>
+            <w:r>
+              <w:rPr>
+                <w:rFonts w:ascii="Latha" w:hAnsi="Latha" w:cs="Latha"/>
+                <w:szCs w:val="24"/>
+                <w:cs/>
+                <w:lang w:bidi="ta-IN"/>
+              </w:rPr>
+              <w:t>யா</w:t>
+            </w:r>
+            <w:r>
+              <w:rPr>
+                <w:rFonts w:ascii="BRH Tamil Tab Extra" w:hAnsi="BRH Tamil Tab Extra" w:cs="Latha"/>
+                <w:b/>
+                <w:bCs/>
+                <w:szCs w:val="28"/>
+                <w:lang w:bidi="ta-IN"/>
+              </w:rPr>
+              <w:t>…</w:t>
+            </w:r>
+            <w:r>
+              <w:rPr>
+                <w:rFonts w:ascii="Latha" w:hAnsi="Latha" w:cs="Latha"/>
+                <w:szCs w:val="24"/>
+                <w:cs/>
+                <w:lang w:bidi="ta-IN"/>
+              </w:rPr>
+              <w:t>ஜ்</w:t>
+            </w:r>
+            <w:r>
+              <w:rPr>
+                <w:rFonts w:ascii="Latha" w:hAnsi="Latha" w:cs="Latha"/>
+                <w:szCs w:val="24"/>
+                <w:highlight w:val="green"/>
+                <w:cs/>
+                <w:lang w:bidi="ta-IN"/>
+              </w:rPr>
+              <w:t>யா</w:t>
+            </w:r>
+            <w:r>
+              <w:rPr>
+                <w:rFonts w:ascii="Latha" w:hAnsi="Latha" w:cs="Latha"/>
+                <w:szCs w:val="24"/>
+                <w:lang w:bidi="ta-IN"/>
+              </w:rPr>
+              <w:t xml:space="preserve"> |</w:t>
+            </w:r>
+          </w:p>
+        </w:tc>
+      </w:tr>
+      <w:tr>
+        <w:trPr>
           <w:trHeight w:val="4017"/>
         </w:trPr>
         <w:tc>
@@ -164,147 +1030,584 @@
           </w:tcPr>
           <w:p>
             <w:pPr>
-              <w:widowControl w:val="0"/>
               <w:autoSpaceDE w:val="0"/>
               <w:autoSpaceDN w:val="0"/>
               <w:adjustRightInd w:val="0"/>
-              <w:spacing w:before="0" w:line="240" w:lineRule="auto"/>
-              <w:rPr>
-                <w:rFonts w:ascii="BRH Devanagari Extra" w:hAnsi="BRH Devanagari Extra" w:cs="BRH Devanagari Extra"/>
-                <w:color w:val="000000"/>
-                <w:sz w:val="32"/>
-                <w:szCs w:val="40"/>
+              <w:rPr>
+                <w:rFonts w:ascii="Latha" w:hAnsi="Latha" w:cs="Latha"/>
+                <w:szCs w:val="24"/>
+                <w:lang w:bidi="ta-IN"/>
               </w:rPr>
             </w:pPr>
             <w:r>
               <w:rPr>
-                <w:rFonts w:cs="BRH Devanagari Extra"/>
-                <w:color w:val="000000"/>
-                <w:szCs w:val="40"/>
+                <w:rFonts w:ascii="Latha" w:hAnsi="Latha" w:cs="Latha"/>
+                <w:b/>
+                <w:bCs/>
+                <w:szCs w:val="24"/>
+                <w:cs/>
+                <w:lang w:bidi="ta-IN"/>
               </w:rPr>
               <w:t>65</w:t>
             </w:r>
             <w:r>
               <w:rPr>
-                <w:rFonts w:ascii="BRH Devanagari Extra" w:hAnsi="BRH Devanagari Extra" w:cs="BRH Devanagari Extra"/>
-                <w:color w:val="000000"/>
-                <w:sz w:val="32"/>
-                <w:szCs w:val="40"/>
+                <w:rFonts w:ascii="Latha" w:hAnsi="Latha" w:cs="Latha"/>
+                <w:b/>
+                <w:bCs/>
+                <w:szCs w:val="24"/>
+                <w:lang w:bidi="ta-IN"/>
               </w:rPr>
               <w:t>)</w:t>
             </w:r>
             <w:r>
               <w:rPr>
-                <w:rFonts w:ascii="BRH Devanagari Extra" w:hAnsi="BRH Devanagari Extra" w:cs="BRH Devanagari Extra"/>
-                <w:color w:val="000000"/>
-                <w:sz w:val="32"/>
-                <w:szCs w:val="40"/>
+                <w:rFonts w:ascii="Latha" w:hAnsi="Latha" w:cs="Latha"/>
+                <w:szCs w:val="24"/>
+                <w:lang w:bidi="ta-IN"/>
               </w:rPr>
               <w:tab/>
             </w:r>
             <w:r>
               <w:rPr>
-                <w:rFonts w:cs="BRH Devanagari Extra"/>
-                <w:color w:val="000000"/>
-                <w:szCs w:val="40"/>
-              </w:rPr>
-              <w:t>2</w:t>
-            </w:r>
-            <w:r>
-              <w:rPr>
-                <w:rFonts w:ascii="BRH Devanagari Extra" w:hAnsi="BRH Devanagari Extra" w:cs="BRH Devanagari Extra"/>
-                <w:color w:val="000000"/>
-                <w:sz w:val="32"/>
-                <w:szCs w:val="40"/>
+                <w:rFonts w:ascii="Latha" w:hAnsi="Latha" w:cs="Latha"/>
+                <w:b/>
+                <w:bCs/>
+                <w:szCs w:val="24"/>
+                <w:cs/>
+                <w:lang w:bidi="ta-IN"/>
+              </w:rPr>
+              <w:t>2.3</w:t>
+            </w:r>
+            <w:r>
+              <w:rPr>
+                <w:rFonts w:ascii="Latha" w:hAnsi="Latha" w:cs="Latha"/>
+                <w:b/>
+                <w:bCs/>
+                <w:szCs w:val="24"/>
+                <w:lang w:bidi="ta-IN"/>
               </w:rPr>
               <w:t>.</w:t>
             </w:r>
             <w:r>
               <w:rPr>
-                <w:rFonts w:cs="BRH Devanagari Extra"/>
-                <w:color w:val="000000"/>
-                <w:szCs w:val="40"/>
-              </w:rPr>
-              <w:t>3</w:t>
-            </w:r>
-            <w:r>
-              <w:rPr>
-                <w:rFonts w:ascii="BRH Devanagari Extra" w:hAnsi="BRH Devanagari Extra" w:cs="BRH Devanagari Extra"/>
-                <w:color w:val="000000"/>
-                <w:sz w:val="32"/>
-                <w:szCs w:val="40"/>
+                <w:rFonts w:ascii="Latha" w:hAnsi="Latha" w:cs="Latha"/>
+                <w:b/>
+                <w:bCs/>
+                <w:szCs w:val="24"/>
+                <w:cs/>
+                <w:lang w:bidi="ta-IN"/>
+              </w:rPr>
+              <w:t>12</w:t>
+            </w:r>
+            <w:r>
+              <w:rPr>
+                <w:rFonts w:ascii="Latha" w:hAnsi="Latha" w:cs="Latha"/>
+                <w:b/>
+                <w:bCs/>
+                <w:szCs w:val="24"/>
+                <w:lang w:bidi="ta-IN"/>
+              </w:rPr>
+              <w:t>.2</w:t>
+            </w:r>
+            <w:r>
+              <w:rPr>
+                <w:rFonts w:ascii="Latha" w:hAnsi="Latha" w:cs="Latha"/>
+                <w:b/>
+                <w:bCs/>
+                <w:szCs w:val="24"/>
+                <w:lang w:bidi="ta-IN"/>
+              </w:rPr>
+              <w:t>(</w:t>
+            </w:r>
+            <w:r>
+              <w:rPr>
+                <w:rFonts w:ascii="Latha" w:hAnsi="Latha" w:cs="Latha"/>
+                <w:b/>
+                <w:bCs/>
+                <w:szCs w:val="24"/>
+                <w:cs/>
+                <w:lang w:bidi="ta-IN"/>
+              </w:rPr>
+              <w:t>51</w:t>
+            </w:r>
+            <w:r>
+              <w:rPr>
+                <w:rFonts w:ascii="Latha" w:hAnsi="Latha" w:cs="Latha"/>
+                <w:b/>
+                <w:bCs/>
+                <w:szCs w:val="24"/>
+                <w:lang w:bidi="ta-IN"/>
+              </w:rPr>
+              <w:t>)</w:t>
+            </w:r>
+            <w:r>
+              <w:rPr>
+                <w:rFonts w:ascii="Latha" w:hAnsi="Latha" w:cs="Latha"/>
+                <w:szCs w:val="24"/>
+                <w:lang w:bidi="ta-IN"/>
+              </w:rPr>
+              <w:t xml:space="preserve">-  </w:t>
+            </w:r>
+            <w:r>
+              <w:rPr>
+                <w:rFonts w:ascii="Latha" w:hAnsi="Latha" w:cs="Latha"/>
+                <w:szCs w:val="24"/>
+                <w:cs/>
+                <w:lang w:bidi="ta-IN"/>
+              </w:rPr>
+              <w:t>புன</w:t>
+            </w:r>
+            <w:r>
+              <w:rPr>
+                <w:rFonts w:ascii="BRH Tamil Tab Extra" w:hAnsi="BRH Tamil Tab Extra" w:cs="Latha"/>
+                <w:b/>
+                <w:bCs/>
+                <w:szCs w:val="28"/>
+                <w:lang w:bidi="ta-IN"/>
+              </w:rPr>
+              <w:t>†</w:t>
+            </w:r>
+            <w:r>
+              <w:rPr>
+                <w:rFonts w:ascii="Latha" w:hAnsi="Latha" w:cs="Latha"/>
+                <w:b/>
+                <w:bCs/>
+                <w:szCs w:val="28"/>
+                <w:cs/>
+                <w:lang w:bidi="ta-IN"/>
+              </w:rPr>
+              <w:t>:</w:t>
+            </w:r>
+            <w:r>
+              <w:rPr>
+                <w:rFonts w:ascii="Latha" w:hAnsi="Latha" w:cs="Latha"/>
+                <w:szCs w:val="24"/>
+                <w:cs/>
+                <w:lang w:bidi="ta-IN"/>
+              </w:rPr>
+              <w:t xml:space="preserve"> </w:t>
+            </w:r>
+            <w:r>
+              <w:rPr>
+                <w:rFonts w:ascii="Latha" w:hAnsi="Latha" w:cs="Latha"/>
+                <w:szCs w:val="24"/>
+                <w:lang w:bidi="ta-IN"/>
+              </w:rPr>
+              <w:t xml:space="preserve">| </w:t>
+            </w:r>
+            <w:r>
+              <w:rPr>
+                <w:rFonts w:ascii="Latha" w:hAnsi="Latha" w:cs="Latha"/>
+                <w:szCs w:val="24"/>
+                <w:cs/>
+                <w:lang w:bidi="ta-IN"/>
+              </w:rPr>
+              <w:t>ஏ</w:t>
+            </w:r>
+            <w:r>
+              <w:rPr>
+                <w:rFonts w:ascii="Latha" w:hAnsi="Latha" w:cs="Latha"/>
+                <w:szCs w:val="24"/>
+                <w:highlight w:val="yellow"/>
+                <w:cs/>
+                <w:lang w:bidi="ta-IN"/>
+              </w:rPr>
+              <w:t>த்யே</w:t>
+            </w:r>
+            <w:r>
+              <w:rPr>
+                <w:rFonts w:ascii="Latha" w:hAnsi="Latha" w:cs="Latha"/>
+                <w:szCs w:val="24"/>
+                <w:cs/>
+                <w:lang w:bidi="ta-IN"/>
+              </w:rPr>
+              <w:t>த்ய</w:t>
+            </w:r>
+            <w:r>
+              <w:rPr>
+                <w:rFonts w:ascii="BRH Tamil Tab Extra" w:hAnsi="BRH Tamil Tab Extra" w:cs="Latha"/>
+                <w:b/>
+                <w:bCs/>
+                <w:szCs w:val="28"/>
+                <w:lang w:bidi="ta-IN"/>
+              </w:rPr>
+              <w:t>†</w:t>
+            </w:r>
+            <w:r>
+              <w:rPr>
+                <w:rFonts w:ascii="Latha" w:hAnsi="Latha" w:cs="Latha"/>
+                <w:szCs w:val="24"/>
+                <w:lang w:bidi="ta-IN"/>
+              </w:rPr>
+              <w:t xml:space="preserve"> |</w:t>
+            </w:r>
+          </w:p>
+          <w:p>
+            <w:pPr>
+              <w:autoSpaceDE w:val="0"/>
+              <w:autoSpaceDN w:val="0"/>
+              <w:adjustRightInd w:val="0"/>
+              <w:rPr>
+                <w:rFonts w:ascii="Latha" w:hAnsi="Latha" w:cs="Latha"/>
+                <w:szCs w:val="24"/>
+                <w:lang w:bidi="ta-IN"/>
+              </w:rPr>
+            </w:pPr>
+            <w:r>
+              <w:rPr>
+                <w:rFonts w:ascii="Latha" w:hAnsi="Latha" w:cs="Latha"/>
+                <w:szCs w:val="24"/>
+                <w:cs/>
+                <w:lang w:bidi="ta-IN"/>
+              </w:rPr>
+              <w:t>புன</w:t>
+            </w:r>
+            <w:r>
+              <w:rPr>
+                <w:rFonts w:ascii="BRH Tamil Tab Extra" w:hAnsi="BRH Tamil Tab Extra" w:cs="Latha"/>
+                <w:b/>
+                <w:bCs/>
+                <w:szCs w:val="28"/>
+                <w:lang w:bidi="ta-IN"/>
+              </w:rPr>
+              <w:t>…</w:t>
+            </w:r>
+            <w:r>
+              <w:rPr>
+                <w:rFonts w:ascii="Latha" w:hAnsi="Latha" w:cs="Latha"/>
+                <w:szCs w:val="24"/>
+                <w:lang w:bidi="ta-IN"/>
+              </w:rPr>
+              <w:t xml:space="preserve"> </w:t>
+            </w:r>
+            <w:r>
+              <w:rPr>
+                <w:rFonts w:ascii="Latha" w:hAnsi="Latha" w:cs="Latha"/>
+                <w:szCs w:val="24"/>
+                <w:highlight w:val="yellow"/>
+                <w:cs/>
+                <w:lang w:bidi="ta-IN"/>
+              </w:rPr>
+              <w:t>ரேத்யே த்யை</w:t>
+            </w:r>
+            <w:r>
+              <w:rPr>
+                <w:rFonts w:ascii="Latha" w:hAnsi="Latha" w:cs="Latha"/>
+                <w:szCs w:val="24"/>
+                <w:cs/>
+                <w:lang w:bidi="ta-IN"/>
+              </w:rPr>
+              <w:t>த்யேத்ய</w:t>
+            </w:r>
+            <w:r>
+              <w:rPr>
+                <w:rFonts w:ascii="BRH Tamil Tab Extra" w:hAnsi="BRH Tamil Tab Extra" w:cs="Latha"/>
+                <w:b/>
+                <w:bCs/>
+                <w:szCs w:val="28"/>
+                <w:lang w:bidi="ta-IN"/>
+              </w:rPr>
+              <w:t>…</w:t>
+            </w:r>
+            <w:r>
+              <w:rPr>
+                <w:rFonts w:ascii="Latha" w:hAnsi="Latha" w:cs="Latha"/>
+                <w:szCs w:val="24"/>
+                <w:lang w:bidi="ta-IN"/>
+              </w:rPr>
+              <w:t xml:space="preserve"> </w:t>
+            </w:r>
+            <w:r>
+              <w:rPr>
+                <w:rFonts w:ascii="Latha" w:hAnsi="Latha" w:cs="Latha"/>
+                <w:szCs w:val="24"/>
+                <w:cs/>
+                <w:lang w:bidi="ta-IN"/>
+              </w:rPr>
+              <w:t>புன</w:t>
+            </w:r>
+            <w:r>
+              <w:rPr>
+                <w:rFonts w:ascii="BRH Tamil Tab Extra" w:hAnsi="BRH Tamil Tab Extra" w:cs="Latha"/>
+                <w:b/>
+                <w:bCs/>
+                <w:szCs w:val="28"/>
+                <w:lang w:bidi="ta-IN"/>
+              </w:rPr>
+              <w:t>…</w:t>
+            </w:r>
+            <w:r>
+              <w:rPr>
+                <w:rFonts w:ascii="Latha" w:hAnsi="Latha" w:cs="Latha"/>
+                <w:b/>
+                <w:bCs/>
+                <w:szCs w:val="28"/>
+                <w:cs/>
+                <w:lang w:bidi="ta-IN"/>
+              </w:rPr>
+              <w:t>:</w:t>
+            </w:r>
+            <w:r>
+              <w:rPr>
+                <w:rFonts w:ascii="Latha" w:hAnsi="Latha" w:cs="Latha"/>
+                <w:szCs w:val="24"/>
+                <w:cs/>
+                <w:lang w:bidi="ta-IN"/>
+              </w:rPr>
+              <w:t xml:space="preserve"> புன</w:t>
+            </w:r>
+            <w:r>
+              <w:rPr>
+                <w:rFonts w:ascii="BRH Tamil Tab Extra" w:hAnsi="BRH Tamil Tab Extra" w:cs="Latha"/>
+                <w:b/>
+                <w:bCs/>
+                <w:szCs w:val="28"/>
+                <w:lang w:bidi="ta-IN"/>
+              </w:rPr>
+              <w:t>…</w:t>
+            </w:r>
+            <w:r>
+              <w:rPr>
+                <w:rFonts w:ascii="Latha" w:hAnsi="Latha" w:cs="Latha"/>
+                <w:szCs w:val="24"/>
+                <w:lang w:bidi="ta-IN"/>
+              </w:rPr>
+              <w:t xml:space="preserve"> </w:t>
+            </w:r>
+            <w:r>
+              <w:rPr>
+                <w:rFonts w:ascii="Latha" w:hAnsi="Latha" w:cs="Latha"/>
+                <w:szCs w:val="24"/>
+                <w:highlight w:val="yellow"/>
+                <w:cs/>
+                <w:lang w:bidi="ta-IN"/>
+              </w:rPr>
+              <w:t>ரேத்யேத்ய</w:t>
+            </w:r>
+            <w:r>
+              <w:rPr>
+                <w:rFonts w:ascii="BRH Tamil Tab Extra" w:hAnsi="BRH Tamil Tab Extra" w:cs="Latha"/>
+                <w:b/>
+                <w:bCs/>
+                <w:szCs w:val="28"/>
+                <w:highlight w:val="yellow"/>
+                <w:lang w:bidi="ta-IN"/>
+              </w:rPr>
+              <w:t>†</w:t>
+            </w:r>
+            <w:r>
+              <w:rPr>
+                <w:rFonts w:ascii="Latha" w:hAnsi="Latha" w:cs="Latha"/>
+                <w:szCs w:val="24"/>
+                <w:lang w:bidi="ta-IN"/>
+              </w:rPr>
+              <w:t xml:space="preserve"> | </w:t>
+            </w:r>
+          </w:p>
+          <w:p>
+            <w:pPr>
+              <w:autoSpaceDE w:val="0"/>
+              <w:autoSpaceDN w:val="0"/>
+              <w:adjustRightInd w:val="0"/>
+              <w:rPr>
+                <w:rFonts w:ascii="Latha" w:hAnsi="Latha" w:cs="Latha"/>
+                <w:szCs w:val="24"/>
+                <w:lang w:bidi="ta-IN"/>
+              </w:rPr>
+            </w:pPr>
+            <w:r>
+              <w:rPr>
+                <w:rFonts w:ascii="Latha" w:hAnsi="Latha" w:cs="Latha"/>
+                <w:b/>
+                <w:bCs/>
+                <w:szCs w:val="24"/>
+                <w:cs/>
+                <w:lang w:bidi="ta-IN"/>
+              </w:rPr>
+              <w:t>6</w:t>
+            </w:r>
+            <w:r>
+              <w:rPr>
+                <w:rFonts w:ascii="Latha" w:hAnsi="Latha" w:cs="Latha"/>
+                <w:b/>
+                <w:bCs/>
+                <w:szCs w:val="24"/>
+                <w:lang w:bidi="ta-IN"/>
+              </w:rPr>
+              <w:t>6</w:t>
+            </w:r>
+            <w:r>
+              <w:rPr>
+                <w:rFonts w:ascii="Latha" w:hAnsi="Latha" w:cs="Latha"/>
+                <w:b/>
+                <w:bCs/>
+                <w:szCs w:val="24"/>
+                <w:lang w:bidi="ta-IN"/>
+              </w:rPr>
+              <w:t>)</w:t>
+            </w:r>
+            <w:r>
+              <w:rPr>
+                <w:rFonts w:ascii="Latha" w:hAnsi="Latha" w:cs="Latha"/>
+                <w:szCs w:val="24"/>
+                <w:lang w:bidi="ta-IN"/>
+              </w:rPr>
+              <w:tab/>
+            </w:r>
+            <w:r>
+              <w:rPr>
+                <w:rFonts w:ascii="Latha" w:hAnsi="Latha" w:cs="Latha"/>
+                <w:b/>
+                <w:bCs/>
+                <w:szCs w:val="24"/>
+                <w:cs/>
+                <w:lang w:bidi="ta-IN"/>
+              </w:rPr>
+              <w:t>2.3</w:t>
+            </w:r>
+            <w:r>
+              <w:rPr>
+                <w:rFonts w:ascii="Latha" w:hAnsi="Latha" w:cs="Latha"/>
+                <w:b/>
+                <w:bCs/>
+                <w:szCs w:val="24"/>
+                <w:lang w:bidi="ta-IN"/>
               </w:rPr>
               <w:t>.</w:t>
             </w:r>
             <w:r>
               <w:rPr>
-                <w:rFonts w:cs="BRH Devanagari Extra"/>
-                <w:color w:val="000000"/>
-                <w:szCs w:val="40"/>
+                <w:rFonts w:ascii="Latha" w:hAnsi="Latha" w:cs="Latha"/>
+                <w:b/>
+                <w:bCs/>
+                <w:szCs w:val="24"/>
+                <w:cs/>
+                <w:lang w:bidi="ta-IN"/>
               </w:rPr>
               <w:t>12</w:t>
             </w:r>
             <w:r>
               <w:rPr>
-                <w:rFonts w:ascii="BRH Devanagari Extra" w:hAnsi="BRH Devanagari Extra" w:cs="BRH Devanagari Extra"/>
-                <w:color w:val="000000"/>
-                <w:sz w:val="32"/>
-                <w:szCs w:val="40"/>
-              </w:rPr>
-              <w:t>.</w:t>
-            </w:r>
-            <w:r>
-              <w:rPr>
-                <w:rFonts w:cs="BRH Devanagari Extra"/>
-                <w:color w:val="000000"/>
-                <w:szCs w:val="40"/>
-              </w:rPr>
-              <w:t>2</w:t>
-            </w:r>
-            <w:r>
-              <w:rPr>
-                <w:rFonts w:ascii="BRH Devanagari Extra" w:hAnsi="BRH Devanagari Extra" w:cs="BRH Devanagari Extra"/>
-                <w:color w:val="000000"/>
-                <w:sz w:val="32"/>
-                <w:szCs w:val="40"/>
+                <w:rFonts w:ascii="Latha" w:hAnsi="Latha" w:cs="Latha"/>
+                <w:b/>
+                <w:bCs/>
+                <w:szCs w:val="24"/>
+                <w:lang w:bidi="ta-IN"/>
+              </w:rPr>
+              <w:t>.2</w:t>
+            </w:r>
+            <w:r>
+              <w:rPr>
+                <w:rFonts w:ascii="Latha" w:hAnsi="Latha" w:cs="Latha"/>
+                <w:b/>
+                <w:bCs/>
+                <w:szCs w:val="24"/>
+                <w:lang w:bidi="ta-IN"/>
               </w:rPr>
               <w:t>(</w:t>
             </w:r>
             <w:r>
               <w:rPr>
-                <w:rFonts w:cs="BRH Devanagari Extra"/>
-                <w:color w:val="000000"/>
-                <w:szCs w:val="40"/>
-              </w:rPr>
-              <w:t>51</w:t>
-            </w:r>
-            <w:r>
-              <w:rPr>
-                <w:rFonts w:ascii="BRH Devanagari Extra" w:hAnsi="BRH Devanagari Extra" w:cs="BRH Devanagari Extra"/>
-                <w:color w:val="000000"/>
-                <w:sz w:val="32"/>
-                <w:szCs w:val="40"/>
-              </w:rPr>
-              <w:t>)-  mÉÑlÉþÈ | L</w:t>
-            </w:r>
-            <w:r>
-              <w:rPr>
-                <w:rFonts w:ascii="BRH Devanagari Extra" w:hAnsi="BRH Devanagari Extra" w:cs="BRH Devanagari Extra"/>
-                <w:color w:val="000000"/>
-                <w:sz w:val="32"/>
-                <w:szCs w:val="40"/>
+                <w:rFonts w:ascii="Latha" w:hAnsi="Latha" w:cs="Latha"/>
+                <w:b/>
+                <w:bCs/>
+                <w:szCs w:val="24"/>
+                <w:cs/>
+                <w:lang w:bidi="ta-IN"/>
+              </w:rPr>
+              <w:t>52)</w:t>
+            </w:r>
+            <w:r>
+              <w:rPr>
+                <w:rFonts w:ascii="Latha" w:hAnsi="Latha" w:cs="Latha"/>
+                <w:szCs w:val="24"/>
+                <w:lang w:bidi="ta-IN"/>
+              </w:rPr>
+              <w:t xml:space="preserve">-  </w:t>
+            </w:r>
+            <w:r>
+              <w:rPr>
+                <w:rFonts w:ascii="Latha" w:hAnsi="Latha" w:cs="Latha"/>
+                <w:szCs w:val="24"/>
+                <w:cs/>
+                <w:lang w:bidi="ta-IN"/>
+              </w:rPr>
+              <w:t>ஏ</w:t>
+            </w:r>
+            <w:r>
+              <w:rPr>
+                <w:rFonts w:ascii="Latha" w:hAnsi="Latha" w:cs="Latha"/>
+                <w:szCs w:val="24"/>
                 <w:highlight w:val="yellow"/>
-              </w:rPr>
-              <w:t>irÉ</w:t>
-            </w:r>
-            <w:r>
-              <w:rPr>
-                <w:rFonts w:ascii="BRH Devanagari Extra" w:hAnsi="BRH Devanagari Extra" w:cs="BRH Devanagari Extra"/>
-                <w:color w:val="000000"/>
-                <w:sz w:val="32"/>
-                <w:szCs w:val="40"/>
-              </w:rPr>
-              <w:t>åirÉþ |</w:t>
+                <w:cs/>
+                <w:lang w:bidi="ta-IN"/>
+              </w:rPr>
+              <w:t>த்யே</w:t>
+            </w:r>
+            <w:r>
+              <w:rPr>
+                <w:rFonts w:ascii="Latha" w:hAnsi="Latha" w:cs="Latha"/>
+                <w:szCs w:val="24"/>
+                <w:cs/>
+                <w:lang w:bidi="ta-IN"/>
+              </w:rPr>
+              <w:t>த்ய</w:t>
+            </w:r>
+            <w:r>
+              <w:rPr>
+                <w:rFonts w:ascii="BRH Tamil Tab Extra" w:hAnsi="BRH Tamil Tab Extra" w:cs="Latha"/>
+                <w:b/>
+                <w:bCs/>
+                <w:szCs w:val="28"/>
+                <w:lang w:bidi="ta-IN"/>
+              </w:rPr>
+              <w:t>†</w:t>
+            </w:r>
+            <w:r>
+              <w:rPr>
+                <w:rFonts w:ascii="Latha" w:hAnsi="Latha" w:cs="Latha"/>
+                <w:szCs w:val="24"/>
+                <w:lang w:bidi="ta-IN"/>
+              </w:rPr>
+              <w:t xml:space="preserve"> | </w:t>
+            </w:r>
+            <w:r>
+              <w:rPr>
+                <w:rFonts w:ascii="Latha" w:hAnsi="Latha" w:cs="Latha"/>
+                <w:szCs w:val="24"/>
+                <w:cs/>
+                <w:lang w:bidi="ta-IN"/>
+              </w:rPr>
+              <w:t>நி</w:t>
+            </w:r>
+            <w:r>
+              <w:rPr>
+                <w:rFonts w:ascii="Latha" w:hAnsi="Latha" w:cs="Latha"/>
+                <w:b/>
+                <w:bCs/>
+                <w:szCs w:val="28"/>
+                <w:cs/>
+                <w:lang w:bidi="ta-IN"/>
+              </w:rPr>
+              <w:t>:</w:t>
+            </w:r>
+            <w:r>
+              <w:rPr>
+                <w:rFonts w:ascii="Latha" w:hAnsi="Latha" w:cs="Latha"/>
+                <w:szCs w:val="24"/>
+                <w:cs/>
+                <w:lang w:bidi="ta-IN"/>
+              </w:rPr>
+              <w:t xml:space="preserve"> </w:t>
+            </w:r>
+            <w:r>
+              <w:rPr>
+                <w:rFonts w:ascii="Latha" w:hAnsi="Latha" w:cs="Latha"/>
+                <w:szCs w:val="24"/>
+                <w:lang w:bidi="ta-IN"/>
+              </w:rPr>
+              <w:t>|</w:t>
             </w:r>
           </w:p>
           <w:p>
@@ -323,109 +1626,254 @@
             </w:pPr>
             <w:r>
               <w:rPr>
-                <w:rFonts w:ascii="BRH Devanagari Extra" w:hAnsi="BRH Devanagari Extra" w:cs="BRH Devanagari Extra"/>
-                <w:color w:val="000000"/>
-                <w:sz w:val="32"/>
-                <w:szCs w:val="40"/>
-              </w:rPr>
-              <w:t>mÉÑlÉ</w:t>
-            </w:r>
-            <w:r>
-              <w:rPr>
-                <w:rFonts w:ascii="BRH Malayalam Extra" w:hAnsi="BRH Malayalam Extra" w:cs="BRH Devanagari Extra"/>
-                <w:color w:val="000000"/>
-                <w:szCs w:val="40"/>
-              </w:rPr>
-              <w:t>–</w:t>
-            </w:r>
-            <w:r>
-              <w:rPr>
-                <w:rFonts w:ascii="BRH Devanagari Extra" w:hAnsi="BRH Devanagari Extra" w:cs="BRH Devanagari Extra"/>
-                <w:color w:val="000000"/>
-                <w:sz w:val="32"/>
-                <w:szCs w:val="40"/>
+                <w:rFonts w:ascii="Latha" w:hAnsi="Latha" w:cs="Latha"/>
+                <w:szCs w:val="24"/>
+                <w:highlight w:val="yellow"/>
+                <w:cs/>
+                <w:lang w:bidi="ta-IN"/>
+              </w:rPr>
+              <w:t>ஏத்யேத்ய</w:t>
+            </w:r>
+            <w:r>
+              <w:rPr>
+                <w:rFonts w:ascii="BRH Tamil Tab Extra" w:hAnsi="BRH Tamil Tab Extra" w:cs="Latha"/>
+                <w:b/>
+                <w:bCs/>
+                <w:szCs w:val="28"/>
+                <w:highlight w:val="yellow"/>
+                <w:lang w:bidi="ta-IN"/>
+              </w:rPr>
+              <w:t>…</w:t>
+            </w:r>
+            <w:r>
+              <w:rPr>
+                <w:rFonts w:ascii="Latha" w:hAnsi="Latha" w:cs="Latha"/>
+                <w:szCs w:val="24"/>
+                <w:lang w:bidi="ta-IN"/>
               </w:rPr>
               <w:t xml:space="preserve"> </w:t>
             </w:r>
             <w:r>
               <w:rPr>
-                <w:rFonts w:ascii="BRH Devanagari Extra" w:hAnsi="BRH Devanagari Extra" w:cs="BRH Devanagari Extra"/>
-                <w:color w:val="000000"/>
-                <w:sz w:val="32"/>
-                <w:szCs w:val="40"/>
+                <w:rFonts w:ascii="Latha" w:hAnsi="Latha" w:cs="Latha"/>
+                <w:szCs w:val="24"/>
+                <w:cs/>
+                <w:lang w:bidi="ta-IN"/>
+              </w:rPr>
+              <w:t>நிர் ணிரே</w:t>
+            </w:r>
+            <w:r>
+              <w:rPr>
+                <w:rFonts w:ascii="Latha" w:hAnsi="Latha" w:cs="Latha"/>
+                <w:szCs w:val="24"/>
                 <w:highlight w:val="yellow"/>
-              </w:rPr>
-              <w:t>UåirÉå irÉæ irÉåirÉ</w:t>
-            </w:r>
-            <w:r>
-              <w:rPr>
-                <w:rFonts w:ascii="BRH Malayalam Extra" w:hAnsi="BRH Malayalam Extra" w:cs="BRH Devanagari Extra"/>
-                <w:color w:val="000000"/>
-                <w:szCs w:val="40"/>
-              </w:rPr>
-              <w:t>–</w:t>
-            </w:r>
-            <w:r>
-              <w:rPr>
-                <w:rFonts w:ascii="BRH Devanagari Extra" w:hAnsi="BRH Devanagari Extra" w:cs="BRH Devanagari Extra"/>
-                <w:color w:val="000000"/>
-                <w:sz w:val="32"/>
-                <w:szCs w:val="40"/>
-              </w:rPr>
-              <w:t xml:space="preserve"> mÉÑlÉ</w:t>
-            </w:r>
-            <w:r>
-              <w:rPr>
-                <w:rFonts w:ascii="BRH Malayalam Extra" w:hAnsi="BRH Malayalam Extra" w:cs="BRH Devanagari Extra"/>
-                <w:color w:val="000000"/>
-                <w:szCs w:val="40"/>
-              </w:rPr>
-              <w:t>–</w:t>
-            </w:r>
-            <w:r>
-              <w:rPr>
-                <w:rFonts w:ascii="BRH Devanagari Extra" w:hAnsi="BRH Devanagari Extra" w:cs="BRH Devanagari Extra"/>
-                <w:color w:val="000000"/>
-                <w:sz w:val="32"/>
-                <w:szCs w:val="40"/>
-              </w:rPr>
-              <w:t>È mÉÑlÉ</w:t>
-            </w:r>
-            <w:r>
-              <w:rPr>
-                <w:rFonts w:ascii="BRH Malayalam Extra" w:hAnsi="BRH Malayalam Extra" w:cs="BRH Devanagari Extra"/>
-                <w:color w:val="000000"/>
-                <w:szCs w:val="40"/>
-              </w:rPr>
-              <w:t>–</w:t>
-            </w:r>
-            <w:r>
-              <w:rPr>
-                <w:rFonts w:ascii="BRH Devanagari Extra" w:hAnsi="BRH Devanagari Extra" w:cs="BRH Devanagari Extra"/>
-                <w:color w:val="000000"/>
-                <w:sz w:val="32"/>
-                <w:szCs w:val="40"/>
+                <w:cs/>
+                <w:lang w:bidi="ta-IN"/>
+              </w:rPr>
+              <w:t>த்யே த்யைத்யேத்ய</w:t>
+            </w:r>
+            <w:r>
+              <w:rPr>
+                <w:rFonts w:ascii="BRH Tamil Tab Extra" w:hAnsi="BRH Tamil Tab Extra" w:cs="Latha"/>
+                <w:b/>
+                <w:bCs/>
+                <w:szCs w:val="28"/>
+                <w:lang w:bidi="ta-IN"/>
+              </w:rPr>
+              <w:t>…</w:t>
+            </w:r>
+            <w:r>
+              <w:rPr>
+                <w:rFonts w:ascii="Latha" w:hAnsi="Latha" w:cs="Latha"/>
+                <w:szCs w:val="24"/>
+                <w:lang w:bidi="ta-IN"/>
               </w:rPr>
               <w:t xml:space="preserve"> </w:t>
             </w:r>
             <w:r>
               <w:rPr>
-                <w:rFonts w:ascii="BRH Devanagari Extra" w:hAnsi="BRH Devanagari Extra" w:cs="BRH Devanagari Extra"/>
-                <w:color w:val="000000"/>
-                <w:sz w:val="32"/>
-                <w:szCs w:val="40"/>
+                <w:rFonts w:ascii="Latha" w:hAnsi="Latha" w:cs="Latha"/>
+                <w:szCs w:val="24"/>
+                <w:cs/>
+                <w:lang w:bidi="ta-IN"/>
+              </w:rPr>
+              <w:t>நி</w:t>
+            </w:r>
+            <w:r>
+              <w:rPr>
+                <w:rFonts w:ascii="Latha" w:hAnsi="Latha" w:cs="Latha"/>
+                <w:b/>
+                <w:bCs/>
+                <w:szCs w:val="28"/>
+                <w:cs/>
+                <w:lang w:bidi="ta-IN"/>
+              </w:rPr>
+              <w:t>:</w:t>
+            </w:r>
+            <w:r>
+              <w:rPr>
+                <w:rFonts w:ascii="Latha" w:hAnsi="Latha" w:cs="Latha"/>
+                <w:szCs w:val="24"/>
+                <w:cs/>
+                <w:lang w:bidi="ta-IN"/>
+              </w:rPr>
+              <w:t xml:space="preserve"> </w:t>
+            </w:r>
+            <w:r>
+              <w:rPr>
+                <w:rFonts w:ascii="Latha" w:hAnsi="Latha" w:cs="Latha"/>
+                <w:szCs w:val="24"/>
+                <w:lang w:bidi="ta-IN"/>
+              </w:rPr>
+              <w:t>|</w:t>
+            </w:r>
+          </w:p>
+          <w:p>
+            <w:pPr>
+              <w:autoSpaceDE w:val="0"/>
+              <w:autoSpaceDN w:val="0"/>
+              <w:adjustRightInd w:val="0"/>
+              <w:rPr>
+                <w:rFonts w:ascii="Latha" w:hAnsi="Latha" w:cs="Latha"/>
+                <w:szCs w:val="24"/>
+                <w:lang w:bidi="ta-IN"/>
+              </w:rPr>
+            </w:pPr>
+            <w:r>
+              <w:rPr>
+                <w:rFonts w:ascii="Latha" w:hAnsi="Latha" w:cs="Latha"/>
+                <w:b/>
+                <w:bCs/>
+                <w:szCs w:val="24"/>
+                <w:cs/>
+                <w:lang w:bidi="ta-IN"/>
+              </w:rPr>
+              <w:t>67)</w:t>
+            </w:r>
+            <w:r>
+              <w:rPr>
+                <w:rFonts w:ascii="Latha" w:hAnsi="Latha" w:cs="Latha"/>
+                <w:szCs w:val="24"/>
+                <w:lang w:bidi="ta-IN"/>
+              </w:rPr>
+              <w:tab/>
+            </w:r>
+            <w:r>
+              <w:rPr>
+                <w:rFonts w:ascii="Latha" w:hAnsi="Latha" w:cs="Latha"/>
+                <w:b/>
+                <w:bCs/>
+                <w:szCs w:val="24"/>
+                <w:cs/>
+                <w:lang w:bidi="ta-IN"/>
+              </w:rPr>
+              <w:t>2.3</w:t>
+            </w:r>
+            <w:r>
+              <w:rPr>
+                <w:rFonts w:ascii="Latha" w:hAnsi="Latha" w:cs="Latha"/>
+                <w:b/>
+                <w:bCs/>
+                <w:szCs w:val="24"/>
+                <w:lang w:bidi="ta-IN"/>
+              </w:rPr>
+              <w:t>.</w:t>
+            </w:r>
+            <w:r>
+              <w:rPr>
+                <w:rFonts w:ascii="Latha" w:hAnsi="Latha" w:cs="Latha"/>
+                <w:b/>
+                <w:bCs/>
+                <w:szCs w:val="24"/>
+                <w:cs/>
+                <w:lang w:bidi="ta-IN"/>
+              </w:rPr>
+              <w:t>12</w:t>
+            </w:r>
+            <w:r>
+              <w:rPr>
+                <w:rFonts w:ascii="Latha" w:hAnsi="Latha" w:cs="Latha"/>
+                <w:b/>
+                <w:bCs/>
+                <w:szCs w:val="24"/>
+                <w:lang w:bidi="ta-IN"/>
+              </w:rPr>
+              <w:t>.2</w:t>
+            </w:r>
+            <w:r>
+              <w:rPr>
+                <w:rFonts w:ascii="Latha" w:hAnsi="Latha" w:cs="Latha"/>
+                <w:b/>
+                <w:bCs/>
+                <w:szCs w:val="24"/>
+                <w:lang w:bidi="ta-IN"/>
+              </w:rPr>
+              <w:t>(</w:t>
+            </w:r>
+            <w:r>
+              <w:rPr>
+                <w:rFonts w:ascii="Latha" w:hAnsi="Latha" w:cs="Latha"/>
+                <w:b/>
+                <w:bCs/>
+                <w:szCs w:val="24"/>
+                <w:cs/>
+                <w:lang w:bidi="ta-IN"/>
+              </w:rPr>
+              <w:t>52)</w:t>
+            </w:r>
+            <w:r>
+              <w:rPr>
+                <w:rFonts w:ascii="Latha" w:hAnsi="Latha" w:cs="Latha"/>
+                <w:szCs w:val="24"/>
+                <w:lang w:bidi="ta-IN"/>
+              </w:rPr>
+              <w:t xml:space="preserve">-  </w:t>
+            </w:r>
+            <w:r>
+              <w:rPr>
+                <w:rFonts w:ascii="Latha" w:hAnsi="Latha" w:cs="Latha"/>
+                <w:szCs w:val="24"/>
+                <w:cs/>
+                <w:lang w:bidi="ta-IN"/>
+              </w:rPr>
+              <w:t>ஏ</w:t>
+            </w:r>
+            <w:r>
+              <w:rPr>
+                <w:rFonts w:ascii="Latha" w:hAnsi="Latha" w:cs="Latha"/>
+                <w:szCs w:val="24"/>
                 <w:highlight w:val="yellow"/>
-              </w:rPr>
-              <w:t>UåirÉåirÉþ</w:t>
-            </w:r>
-            <w:r>
-              <w:rPr>
-                <w:rFonts w:ascii="BRH Devanagari Extra" w:hAnsi="BRH Devanagari Extra" w:cs="BRH Devanagari Extra"/>
-                <w:color w:val="000000"/>
-                <w:sz w:val="32"/>
-                <w:szCs w:val="40"/>
-              </w:rPr>
-              <w:t xml:space="preserve"> | </w:t>
+                <w:cs/>
+                <w:lang w:bidi="ta-IN"/>
+              </w:rPr>
+              <w:t>த்யே</w:t>
+            </w:r>
+            <w:r>
+              <w:rPr>
+                <w:rFonts w:ascii="Latha" w:hAnsi="Latha" w:cs="Latha"/>
+                <w:szCs w:val="24"/>
+                <w:cs/>
+                <w:lang w:bidi="ta-IN"/>
+              </w:rPr>
+              <w:t>த்ய</w:t>
+            </w:r>
+            <w:r>
+              <w:rPr>
+                <w:rFonts w:ascii="BRH Tamil Tab Extra" w:hAnsi="BRH Tamil Tab Extra" w:cs="Latha"/>
+                <w:b/>
+                <w:bCs/>
+                <w:szCs w:val="28"/>
+                <w:lang w:bidi="ta-IN"/>
+              </w:rPr>
+              <w:t>†</w:t>
+            </w:r>
+            <w:r>
+              <w:rPr>
+                <w:rFonts w:ascii="Latha" w:hAnsi="Latha" w:cs="Latha"/>
+                <w:szCs w:val="24"/>
+                <w:lang w:bidi="ta-IN"/>
+              </w:rPr>
+              <w:t xml:space="preserve"> |</w:t>
             </w:r>
           </w:p>
           <w:p>
@@ -436,141 +1884,268 @@
               <w:adjustRightInd w:val="0"/>
               <w:spacing w:before="0" w:line="240" w:lineRule="auto"/>
               <w:rPr>
-                <w:rFonts w:ascii="BRH Devanagari Extra" w:hAnsi="BRH Devanagari Extra" w:cs="BRH Devanagari Extra"/>
-                <w:color w:val="000000"/>
-                <w:sz w:val="32"/>
-                <w:szCs w:val="40"/>
+                <w:rFonts w:cs="Latha"/>
+                <w:b/>
+                <w:bCs/>
+                <w:szCs w:val="24"/>
+                <w:cs/>
+                <w:lang w:bidi="ta-IN"/>
               </w:rPr>
             </w:pPr>
             <w:r>
               <w:rPr>
-                <w:rFonts w:cs="BRH Devanagari Extra"/>
-                <w:color w:val="000000"/>
-                <w:szCs w:val="40"/>
-              </w:rPr>
-              <w:t>66</w:t>
-            </w:r>
-            <w:r>
-              <w:rPr>
-                <w:rFonts w:ascii="BRH Devanagari Extra" w:hAnsi="BRH Devanagari Extra" w:cs="BRH Devanagari Extra"/>
-                <w:color w:val="000000"/>
-                <w:sz w:val="32"/>
-                <w:szCs w:val="40"/>
+                <w:rFonts w:ascii="Latha" w:hAnsi="Latha" w:cs="Latha"/>
+                <w:szCs w:val="24"/>
+                <w:cs/>
+                <w:lang w:bidi="ta-IN"/>
+              </w:rPr>
+              <w:t>ஏத்யேத்யா</w:t>
+            </w:r>
+            <w:r>
+              <w:rPr>
+                <w:rFonts w:ascii="BRH Tamil Tab Extra" w:hAnsi="BRH Tamil Tab Extra" w:cs="Latha"/>
+                <w:b/>
+                <w:bCs/>
+                <w:szCs w:val="28"/>
+                <w:lang w:bidi="ta-IN"/>
+              </w:rPr>
+              <w:t>‡</w:t>
+            </w:r>
+            <w:r>
+              <w:rPr>
+                <w:rFonts w:ascii="Latha" w:hAnsi="Latha" w:cs="Latha"/>
+                <w:szCs w:val="24"/>
+                <w:lang w:bidi="ta-IN"/>
+              </w:rPr>
+              <w:t xml:space="preserve"> - </w:t>
+            </w:r>
+            <w:r>
+              <w:rPr>
+                <w:rFonts w:ascii="Latha" w:hAnsi="Latha" w:cs="Latha"/>
+                <w:szCs w:val="24"/>
+                <w:cs/>
+                <w:lang w:bidi="ta-IN"/>
+              </w:rPr>
+              <w:t>இத்ய</w:t>
+            </w:r>
+            <w:r>
+              <w:rPr>
+                <w:rFonts w:ascii="BRH Tamil Tab Extra" w:hAnsi="BRH Tamil Tab Extra" w:cs="Latha"/>
+                <w:b/>
+                <w:bCs/>
+                <w:szCs w:val="28"/>
+                <w:lang w:bidi="ta-IN"/>
+              </w:rPr>
+              <w:t>†</w:t>
+            </w:r>
+            <w:r>
+              <w:rPr>
+                <w:rFonts w:ascii="Latha" w:hAnsi="Latha" w:cs="Latha"/>
+                <w:szCs w:val="24"/>
+                <w:lang w:bidi="ta-IN"/>
+              </w:rPr>
+              <w:t xml:space="preserve"> |</w:t>
+            </w:r>
+          </w:p>
+        </w:tc>
+        <w:tc>
+          <w:tcPr>
+            <w:tcW w:w="7371" w:type="dxa"/>
+          </w:tcPr>
+          <w:p>
+            <w:pPr>
+              <w:autoSpaceDE w:val="0"/>
+              <w:autoSpaceDN w:val="0"/>
+              <w:adjustRightInd w:val="0"/>
+              <w:rPr>
+                <w:rFonts w:ascii="Latha" w:hAnsi="Latha" w:cs="Latha"/>
+                <w:szCs w:val="24"/>
+                <w:lang w:bidi="ta-IN"/>
+              </w:rPr>
+            </w:pPr>
+            <w:r>
+              <w:rPr>
+                <w:rFonts w:ascii="Latha" w:hAnsi="Latha" w:cs="Latha"/>
+                <w:b/>
+                <w:bCs/>
+                <w:szCs w:val="24"/>
+                <w:cs/>
+                <w:lang w:bidi="ta-IN"/>
+              </w:rPr>
+              <w:t>65</w:t>
+            </w:r>
+            <w:r>
+              <w:rPr>
+                <w:rFonts w:ascii="Latha" w:hAnsi="Latha" w:cs="Latha"/>
+                <w:b/>
+                <w:bCs/>
+                <w:szCs w:val="24"/>
+                <w:lang w:bidi="ta-IN"/>
               </w:rPr>
               <w:t>)</w:t>
             </w:r>
             <w:r>
               <w:rPr>
-                <w:rFonts w:ascii="BRH Devanagari Extra" w:hAnsi="BRH Devanagari Extra" w:cs="BRH Devanagari Extra"/>
-                <w:color w:val="000000"/>
-                <w:sz w:val="32"/>
-                <w:szCs w:val="40"/>
+                <w:rFonts w:ascii="Latha" w:hAnsi="Latha" w:cs="Latha"/>
+                <w:szCs w:val="24"/>
+                <w:lang w:bidi="ta-IN"/>
               </w:rPr>
               <w:tab/>
             </w:r>
             <w:r>
               <w:rPr>
-                <w:rFonts w:cs="BRH Devanagari Extra"/>
-                <w:color w:val="000000"/>
-                <w:szCs w:val="40"/>
-              </w:rPr>
-              <w:t>2</w:t>
-            </w:r>
-            <w:r>
-              <w:rPr>
-                <w:rFonts w:ascii="BRH Devanagari Extra" w:hAnsi="BRH Devanagari Extra" w:cs="BRH Devanagari Extra"/>
-                <w:color w:val="000000"/>
-                <w:sz w:val="32"/>
-                <w:szCs w:val="40"/>
+                <w:rFonts w:ascii="Latha" w:hAnsi="Latha" w:cs="Latha"/>
+                <w:b/>
+                <w:bCs/>
+                <w:szCs w:val="24"/>
+                <w:cs/>
+                <w:lang w:bidi="ta-IN"/>
+              </w:rPr>
+              <w:t>2.3</w:t>
+            </w:r>
+            <w:r>
+              <w:rPr>
+                <w:rFonts w:ascii="Latha" w:hAnsi="Latha" w:cs="Latha"/>
+                <w:b/>
+                <w:bCs/>
+                <w:szCs w:val="24"/>
+                <w:lang w:bidi="ta-IN"/>
               </w:rPr>
               <w:t>.</w:t>
             </w:r>
             <w:r>
               <w:rPr>
-                <w:rFonts w:cs="BRH Devanagari Extra"/>
-                <w:color w:val="000000"/>
-                <w:szCs w:val="40"/>
-              </w:rPr>
-              <w:t>3</w:t>
-            </w:r>
-            <w:r>
-              <w:rPr>
-                <w:rFonts w:ascii="BRH Devanagari Extra" w:hAnsi="BRH Devanagari Extra" w:cs="BRH Devanagari Extra"/>
-                <w:color w:val="000000"/>
-                <w:sz w:val="32"/>
-                <w:szCs w:val="40"/>
-              </w:rPr>
-              <w:t>.</w:t>
-            </w:r>
-            <w:r>
-              <w:rPr>
-                <w:rFonts w:cs="BRH Devanagari Extra"/>
-                <w:color w:val="000000"/>
-                <w:szCs w:val="40"/>
+                <w:rFonts w:ascii="Latha" w:hAnsi="Latha" w:cs="Latha"/>
+                <w:b/>
+                <w:bCs/>
+                <w:szCs w:val="24"/>
+                <w:cs/>
+                <w:lang w:bidi="ta-IN"/>
               </w:rPr>
               <w:t>12</w:t>
             </w:r>
             <w:r>
               <w:rPr>
-                <w:rFonts w:ascii="BRH Devanagari Extra" w:hAnsi="BRH Devanagari Extra" w:cs="BRH Devanagari Extra"/>
-                <w:color w:val="000000"/>
-                <w:sz w:val="32"/>
-                <w:szCs w:val="40"/>
-              </w:rPr>
-              <w:t>.</w:t>
-            </w:r>
-            <w:r>
-              <w:rPr>
-                <w:rFonts w:cs="BRH Devanagari Extra"/>
-                <w:color w:val="000000"/>
-                <w:szCs w:val="40"/>
-              </w:rPr>
-              <w:t>2</w:t>
-            </w:r>
-            <w:r>
-              <w:rPr>
-                <w:rFonts w:ascii="BRH Devanagari Extra" w:hAnsi="BRH Devanagari Extra" w:cs="BRH Devanagari Extra"/>
-                <w:color w:val="000000"/>
-                <w:sz w:val="32"/>
-                <w:szCs w:val="40"/>
+                <w:rFonts w:ascii="Latha" w:hAnsi="Latha" w:cs="Latha"/>
+                <w:b/>
+                <w:bCs/>
+                <w:szCs w:val="24"/>
+                <w:lang w:bidi="ta-IN"/>
+              </w:rPr>
+              <w:t>.2</w:t>
+            </w:r>
+            <w:r>
+              <w:rPr>
+                <w:rFonts w:ascii="Latha" w:hAnsi="Latha" w:cs="Latha"/>
+                <w:b/>
+                <w:bCs/>
+                <w:szCs w:val="24"/>
+                <w:lang w:bidi="ta-IN"/>
               </w:rPr>
               <w:t>(</w:t>
             </w:r>
             <w:r>
               <w:rPr>
-                <w:rFonts w:cs="BRH Devanagari Extra"/>
-                <w:color w:val="000000"/>
-                <w:szCs w:val="40"/>
-              </w:rPr>
-              <w:t>52</w:t>
-            </w:r>
-            <w:r>
-              <w:rPr>
-                <w:rFonts w:ascii="BRH Devanagari Extra" w:hAnsi="BRH Devanagari Extra" w:cs="BRH Devanagari Extra"/>
-                <w:color w:val="000000"/>
-                <w:sz w:val="32"/>
-                <w:szCs w:val="40"/>
-              </w:rPr>
-              <w:t>)-  L</w:t>
-            </w:r>
-            <w:r>
-              <w:rPr>
-                <w:rFonts w:ascii="BRH Devanagari Extra" w:hAnsi="BRH Devanagari Extra" w:cs="BRH Devanagari Extra"/>
-                <w:color w:val="000000"/>
-                <w:sz w:val="32"/>
-                <w:szCs w:val="40"/>
-                <w:highlight w:val="yellow"/>
-              </w:rPr>
-              <w:t>irÉå</w:t>
-            </w:r>
-            <w:r>
-              <w:rPr>
-                <w:rFonts w:ascii="BRH Devanagari Extra" w:hAnsi="BRH Devanagari Extra" w:cs="BRH Devanagari Extra"/>
-                <w:color w:val="000000"/>
-                <w:sz w:val="32"/>
-                <w:szCs w:val="40"/>
-              </w:rPr>
-              <w:t>irÉþ | ÌlÉÈ |</w:t>
+                <w:rFonts w:ascii="Latha" w:hAnsi="Latha" w:cs="Latha"/>
+                <w:b/>
+                <w:bCs/>
+                <w:szCs w:val="24"/>
+                <w:cs/>
+                <w:lang w:bidi="ta-IN"/>
+              </w:rPr>
+              <w:t>51</w:t>
+            </w:r>
+            <w:r>
+              <w:rPr>
+                <w:rFonts w:ascii="Latha" w:hAnsi="Latha" w:cs="Latha"/>
+                <w:b/>
+                <w:bCs/>
+                <w:szCs w:val="24"/>
+                <w:lang w:bidi="ta-IN"/>
+              </w:rPr>
+              <w:t>)</w:t>
+            </w:r>
+            <w:r>
+              <w:rPr>
+                <w:rFonts w:ascii="Latha" w:hAnsi="Latha" w:cs="Latha"/>
+                <w:szCs w:val="24"/>
+                <w:lang w:bidi="ta-IN"/>
+              </w:rPr>
+              <w:t xml:space="preserve">-  </w:t>
+            </w:r>
+            <w:r>
+              <w:rPr>
+                <w:rFonts w:ascii="Latha" w:hAnsi="Latha" w:cs="Latha"/>
+                <w:szCs w:val="24"/>
+                <w:cs/>
+                <w:lang w:bidi="ta-IN"/>
+              </w:rPr>
+              <w:t>புன</w:t>
+            </w:r>
+            <w:r>
+              <w:rPr>
+                <w:rFonts w:ascii="BRH Tamil Tab Extra" w:hAnsi="BRH Tamil Tab Extra" w:cs="Latha"/>
+                <w:b/>
+                <w:bCs/>
+                <w:szCs w:val="28"/>
+                <w:lang w:bidi="ta-IN"/>
+              </w:rPr>
+              <w:t>†</w:t>
+            </w:r>
+            <w:r>
+              <w:rPr>
+                <w:rFonts w:ascii="Latha" w:hAnsi="Latha" w:cs="Latha"/>
+                <w:b/>
+                <w:bCs/>
+                <w:szCs w:val="28"/>
+                <w:cs/>
+                <w:lang w:bidi="ta-IN"/>
+              </w:rPr>
+              <w:t>:</w:t>
+            </w:r>
+            <w:r>
+              <w:rPr>
+                <w:rFonts w:ascii="Latha" w:hAnsi="Latha" w:cs="Latha"/>
+                <w:szCs w:val="24"/>
+                <w:cs/>
+                <w:lang w:bidi="ta-IN"/>
+              </w:rPr>
+              <w:t xml:space="preserve"> </w:t>
+            </w:r>
+            <w:r>
+              <w:rPr>
+                <w:rFonts w:ascii="Latha" w:hAnsi="Latha" w:cs="Latha"/>
+                <w:szCs w:val="24"/>
+                <w:lang w:bidi="ta-IN"/>
+              </w:rPr>
+              <w:t xml:space="preserve">| </w:t>
+            </w:r>
+            <w:r>
+              <w:rPr>
+                <w:rFonts w:ascii="Latha" w:hAnsi="Latha" w:cs="Latha"/>
+                <w:szCs w:val="24"/>
+                <w:cs/>
+                <w:lang w:bidi="ta-IN"/>
+              </w:rPr>
+              <w:t>ஏத்ய</w:t>
+            </w:r>
+            <w:r>
+              <w:rPr>
+                <w:rFonts w:ascii="BRH Tamil Tab Extra" w:hAnsi="BRH Tamil Tab Extra" w:cs="Latha"/>
+                <w:b/>
+                <w:bCs/>
+                <w:szCs w:val="28"/>
+                <w:lang w:bidi="ta-IN"/>
+              </w:rPr>
+              <w:t>†</w:t>
+            </w:r>
+            <w:r>
+              <w:rPr>
+                <w:rFonts w:ascii="Latha" w:hAnsi="Latha" w:cs="Latha"/>
+                <w:szCs w:val="24"/>
+                <w:lang w:bidi="ta-IN"/>
+              </w:rPr>
+              <w:t xml:space="preserve"> |</w:t>
             </w:r>
           </w:p>
           <w:p>
@@ -585,71 +2160,344 @@
                 <w:color w:val="000000"/>
                 <w:sz w:val="32"/>
                 <w:szCs w:val="40"/>
+                <w:lang w:val="it-IT"/>
               </w:rPr>
             </w:pPr>
             <w:r>
               <w:rPr>
-                <w:rFonts w:ascii="BRH Devanagari Extra" w:hAnsi="BRH Devanagari Extra" w:cs="BRH Devanagari Extra"/>
-                <w:color w:val="000000"/>
-                <w:sz w:val="32"/>
-                <w:szCs w:val="40"/>
-                <w:highlight w:val="yellow"/>
-              </w:rPr>
-              <w:t>LirÉåirÉ</w:t>
+                <w:rFonts w:ascii="Latha" w:hAnsi="Latha" w:cs="Latha"/>
+                <w:szCs w:val="24"/>
+                <w:cs/>
+                <w:lang w:bidi="ta-IN"/>
+              </w:rPr>
+              <w:t>புன</w:t>
+            </w:r>
+            <w:r>
+              <w:rPr>
+                <w:rFonts w:ascii="BRH Tamil Tab Extra" w:hAnsi="BRH Tamil Tab Extra" w:cs="Latha"/>
+                <w:b/>
+                <w:bCs/>
+                <w:szCs w:val="28"/>
+                <w:lang w:bidi="ta-IN"/>
+              </w:rPr>
+              <w:t>…</w:t>
+            </w:r>
+            <w:r>
+              <w:rPr>
+                <w:rFonts w:ascii="Latha" w:hAnsi="Latha" w:cs="Latha"/>
+                <w:szCs w:val="24"/>
+                <w:lang w:bidi="ta-IN"/>
+              </w:rPr>
+              <w:t xml:space="preserve"> </w:t>
+            </w:r>
+            <w:r>
+              <w:rPr>
+                <w:rFonts w:ascii="Latha" w:hAnsi="Latha" w:cs="Latha"/>
+                <w:szCs w:val="24"/>
+                <w:highlight w:val="green"/>
+                <w:cs/>
+                <w:lang w:bidi="ta-IN"/>
+              </w:rPr>
+              <w:t>ரேத்யேத்ய</w:t>
+            </w:r>
+            <w:r>
+              <w:rPr>
+                <w:rFonts w:ascii="BRH Tamil Tab Extra" w:hAnsi="BRH Tamil Tab Extra" w:cs="Latha"/>
+                <w:b/>
+                <w:bCs/>
+                <w:szCs w:val="28"/>
+                <w:lang w:bidi="ta-IN"/>
+              </w:rPr>
+              <w:t>……</w:t>
+            </w:r>
+            <w:r>
+              <w:rPr>
+                <w:rFonts w:ascii="Latha" w:hAnsi="Latha" w:cs="Latha"/>
+                <w:szCs w:val="24"/>
+                <w:lang w:bidi="ta-IN"/>
+              </w:rPr>
+              <w:t xml:space="preserve"> </w:t>
+            </w:r>
+            <w:r>
+              <w:rPr>
+                <w:rFonts w:ascii="Latha" w:hAnsi="Latha" w:cs="Latha"/>
+                <w:szCs w:val="24"/>
+                <w:cs/>
+                <w:lang w:bidi="ta-IN"/>
+              </w:rPr>
+              <w:t>புன</w:t>
             </w:r>
             <w:r>
               <w:rPr>
                 <w:rFonts w:ascii="BRH Malayalam Extra" w:hAnsi="BRH Malayalam Extra" w:cs="BRH Devanagari Extra"/>
                 <w:color w:val="000000"/>
                 <w:szCs w:val="40"/>
-                <w:highlight w:val="yellow"/>
+                <w:lang w:val="it-IT"/>
               </w:rPr>
               <w:t>–</w:t>
             </w:r>
             <w:r>
               <w:rPr>
-                <w:rFonts w:ascii="BRH Devanagari Extra" w:hAnsi="BRH Devanagari Extra" w:cs="BRH Devanagari Extra"/>
-                <w:color w:val="000000"/>
-                <w:sz w:val="32"/>
-                <w:szCs w:val="40"/>
-              </w:rPr>
-              <w:t xml:space="preserve"> ÌlÉUç ÍhÉUåirÉå </w:t>
-            </w:r>
-            <w:r>
-              <w:rPr>
-                <w:rFonts w:ascii="BRH Devanagari Extra" w:hAnsi="BRH Devanagari Extra" w:cs="BRH Devanagari Extra"/>
-                <w:color w:val="000000"/>
-                <w:sz w:val="32"/>
-                <w:szCs w:val="40"/>
-                <w:highlight w:val="yellow"/>
-              </w:rPr>
-              <w:t>irÉæirÉåir</w:t>
-            </w:r>
-            <w:r>
-              <w:rPr>
-                <w:rFonts w:ascii="BRH Devanagari Extra" w:hAnsi="BRH Devanagari Extra" w:cs="BRH Devanagari Extra"/>
-                <w:color w:val="000000"/>
-                <w:sz w:val="32"/>
-                <w:szCs w:val="40"/>
-              </w:rPr>
-              <w:t>É</w:t>
-            </w:r>
-            <w:r>
-              <w:rPr>
-                <w:rFonts w:ascii="BRH Malayalam Extra" w:hAnsi="BRH Malayalam Extra" w:cs="BRH Devanagari Extra"/>
-                <w:color w:val="000000"/>
-                <w:szCs w:val="40"/>
-              </w:rPr>
-              <w:t>–</w:t>
-            </w:r>
-            <w:r>
-              <w:rPr>
-                <w:rFonts w:ascii="BRH Devanagari Extra" w:hAnsi="BRH Devanagari Extra" w:cs="BRH Devanagari Extra"/>
-                <w:color w:val="000000"/>
-                <w:sz w:val="32"/>
-                <w:szCs w:val="40"/>
-              </w:rPr>
-              <w:t xml:space="preserve"> ÌlÉÈ | </w:t>
+                <w:rFonts w:ascii="BRH Tamil Tab Extra" w:hAnsi="BRH Tamil Tab Extra" w:cs="Latha"/>
+                <w:b/>
+                <w:bCs/>
+                <w:szCs w:val="28"/>
+                <w:lang w:bidi="ta-IN"/>
+              </w:rPr>
+              <w:t>…</w:t>
+            </w:r>
+            <w:r>
+              <w:rPr>
+                <w:rFonts w:ascii="Latha" w:hAnsi="Latha" w:cs="Latha"/>
+                <w:b/>
+                <w:bCs/>
+                <w:szCs w:val="28"/>
+                <w:cs/>
+                <w:lang w:bidi="ta-IN"/>
+              </w:rPr>
+              <w:t>:</w:t>
+            </w:r>
+            <w:r>
+              <w:rPr>
+                <w:rFonts w:ascii="Latha" w:hAnsi="Latha" w:cs="Latha"/>
+                <w:szCs w:val="24"/>
+                <w:cs/>
+                <w:lang w:bidi="ta-IN"/>
+              </w:rPr>
+              <w:t xml:space="preserve"> புன</w:t>
+            </w:r>
+            <w:r>
+              <w:rPr>
+                <w:rFonts w:ascii="BRH Tamil Tab Extra" w:hAnsi="BRH Tamil Tab Extra" w:cs="Latha"/>
+                <w:b/>
+                <w:bCs/>
+                <w:szCs w:val="28"/>
+                <w:lang w:bidi="ta-IN"/>
+              </w:rPr>
+              <w:t>…</w:t>
+            </w:r>
+            <w:r>
+              <w:rPr>
+                <w:rFonts w:ascii="Latha" w:hAnsi="Latha" w:cs="Latha"/>
+                <w:szCs w:val="24"/>
+                <w:lang w:bidi="ta-IN"/>
+              </w:rPr>
+              <w:t xml:space="preserve"> </w:t>
+            </w:r>
+            <w:r>
+              <w:rPr>
+                <w:rFonts w:ascii="Latha" w:hAnsi="Latha" w:cs="Latha"/>
+                <w:szCs w:val="24"/>
+                <w:highlight w:val="green"/>
+                <w:cs/>
+                <w:lang w:bidi="ta-IN"/>
+              </w:rPr>
+              <w:t>ரேத்ய</w:t>
+            </w:r>
+            <w:r>
+              <w:rPr>
+                <w:rFonts w:ascii="BRH Tamil Tab Extra" w:hAnsi="BRH Tamil Tab Extra" w:cs="Latha"/>
+                <w:b/>
+                <w:bCs/>
+                <w:szCs w:val="28"/>
+                <w:highlight w:val="green"/>
+                <w:lang w:bidi="ta-IN"/>
+              </w:rPr>
+              <w:t>†</w:t>
+            </w:r>
+            <w:r>
+              <w:rPr>
+                <w:rFonts w:ascii="Latha" w:hAnsi="Latha" w:cs="Latha"/>
+                <w:szCs w:val="24"/>
+                <w:lang w:bidi="ta-IN"/>
+              </w:rPr>
+              <w:t xml:space="preserve"> |</w:t>
+            </w:r>
+          </w:p>
+          <w:p>
+            <w:pPr>
+              <w:autoSpaceDE w:val="0"/>
+              <w:autoSpaceDN w:val="0"/>
+              <w:adjustRightInd w:val="0"/>
+              <w:rPr>
+                <w:rFonts w:ascii="Latha" w:hAnsi="Latha" w:cs="Latha"/>
+                <w:szCs w:val="24"/>
+                <w:lang w:bidi="ta-IN"/>
+              </w:rPr>
+            </w:pPr>
+            <w:r>
+              <w:rPr>
+                <w:rFonts w:ascii="Latha" w:hAnsi="Latha" w:cs="Latha"/>
+                <w:b/>
+                <w:bCs/>
+                <w:szCs w:val="24"/>
+                <w:cs/>
+                <w:lang w:bidi="ta-IN"/>
+              </w:rPr>
+              <w:t>6</w:t>
+            </w:r>
+            <w:r>
+              <w:rPr>
+                <w:rFonts w:ascii="Latha" w:hAnsi="Latha" w:cs="Latha"/>
+                <w:b/>
+                <w:bCs/>
+                <w:szCs w:val="24"/>
+                <w:lang w:bidi="ta-IN"/>
+              </w:rPr>
+              <w:t>6</w:t>
+            </w:r>
+            <w:r>
+              <w:rPr>
+                <w:rFonts w:ascii="Latha" w:hAnsi="Latha" w:cs="Latha"/>
+                <w:b/>
+                <w:bCs/>
+                <w:szCs w:val="24"/>
+                <w:lang w:bidi="ta-IN"/>
+              </w:rPr>
+              <w:t>)</w:t>
+            </w:r>
+            <w:r>
+              <w:rPr>
+                <w:rFonts w:ascii="Latha" w:hAnsi="Latha" w:cs="Latha"/>
+                <w:szCs w:val="24"/>
+                <w:lang w:bidi="ta-IN"/>
+              </w:rPr>
+              <w:tab/>
+            </w:r>
+            <w:r>
+              <w:rPr>
+                <w:rFonts w:ascii="Latha" w:hAnsi="Latha" w:cs="Latha"/>
+                <w:b/>
+                <w:bCs/>
+                <w:szCs w:val="24"/>
+                <w:cs/>
+                <w:lang w:bidi="ta-IN"/>
+              </w:rPr>
+              <w:t>2.3</w:t>
+            </w:r>
+            <w:r>
+              <w:rPr>
+                <w:rFonts w:ascii="Latha" w:hAnsi="Latha" w:cs="Latha"/>
+                <w:b/>
+                <w:bCs/>
+                <w:szCs w:val="24"/>
+                <w:lang w:bidi="ta-IN"/>
+              </w:rPr>
+              <w:t>.</w:t>
+            </w:r>
+            <w:r>
+              <w:rPr>
+                <w:rFonts w:ascii="Latha" w:hAnsi="Latha" w:cs="Latha"/>
+                <w:b/>
+                <w:bCs/>
+                <w:szCs w:val="24"/>
+                <w:cs/>
+                <w:lang w:bidi="ta-IN"/>
+              </w:rPr>
+              <w:t>12</w:t>
+            </w:r>
+            <w:r>
+              <w:rPr>
+                <w:rFonts w:ascii="Latha" w:hAnsi="Latha" w:cs="Latha"/>
+                <w:b/>
+                <w:bCs/>
+                <w:szCs w:val="24"/>
+                <w:lang w:bidi="ta-IN"/>
+              </w:rPr>
+              <w:t>.2</w:t>
+            </w:r>
+            <w:r>
+              <w:rPr>
+                <w:rFonts w:ascii="Latha" w:hAnsi="Latha" w:cs="Latha"/>
+                <w:b/>
+                <w:bCs/>
+                <w:szCs w:val="24"/>
+                <w:lang w:bidi="ta-IN"/>
+              </w:rPr>
+              <w:t>(</w:t>
+            </w:r>
+            <w:r>
+              <w:rPr>
+                <w:rFonts w:ascii="Latha" w:hAnsi="Latha" w:cs="Latha"/>
+                <w:b/>
+                <w:bCs/>
+                <w:szCs w:val="24"/>
+                <w:cs/>
+                <w:lang w:bidi="ta-IN"/>
+              </w:rPr>
+              <w:t>52)</w:t>
+            </w:r>
+            <w:r>
+              <w:rPr>
+                <w:rFonts w:ascii="Latha" w:hAnsi="Latha" w:cs="Latha"/>
+                <w:szCs w:val="24"/>
+                <w:lang w:bidi="ta-IN"/>
+              </w:rPr>
+              <w:t xml:space="preserve">-  </w:t>
+            </w:r>
+            <w:r>
+              <w:rPr>
+                <w:rFonts w:ascii="Latha" w:hAnsi="Latha" w:cs="Latha"/>
+                <w:szCs w:val="24"/>
+                <w:cs/>
+                <w:lang w:bidi="ta-IN"/>
+              </w:rPr>
+              <w:t>ஏத்யேத்ய</w:t>
+            </w:r>
+            <w:r>
+              <w:rPr>
+                <w:rFonts w:ascii="BRH Tamil Tab Extra" w:hAnsi="BRH Tamil Tab Extra" w:cs="Latha"/>
+                <w:b/>
+                <w:bCs/>
+                <w:szCs w:val="28"/>
+                <w:lang w:bidi="ta-IN"/>
+              </w:rPr>
+              <w:t>†</w:t>
+            </w:r>
+            <w:r>
+              <w:rPr>
+                <w:rFonts w:ascii="Latha" w:hAnsi="Latha" w:cs="Latha"/>
+                <w:szCs w:val="24"/>
+                <w:lang w:bidi="ta-IN"/>
+              </w:rPr>
+              <w:t xml:space="preserve"> | </w:t>
+            </w:r>
+            <w:r>
+              <w:rPr>
+                <w:rFonts w:ascii="Latha" w:hAnsi="Latha" w:cs="Latha"/>
+                <w:szCs w:val="24"/>
+                <w:cs/>
+                <w:lang w:bidi="ta-IN"/>
+              </w:rPr>
+              <w:t>நி</w:t>
+            </w:r>
+            <w:r>
+              <w:rPr>
+                <w:rFonts w:ascii="Latha" w:hAnsi="Latha" w:cs="Latha"/>
+                <w:b/>
+                <w:bCs/>
+                <w:szCs w:val="28"/>
+                <w:cs/>
+                <w:lang w:bidi="ta-IN"/>
+              </w:rPr>
+              <w:t>:</w:t>
+            </w:r>
+            <w:r>
+              <w:rPr>
+                <w:rFonts w:ascii="Latha" w:hAnsi="Latha" w:cs="Latha"/>
+                <w:szCs w:val="24"/>
+                <w:cs/>
+                <w:lang w:bidi="ta-IN"/>
+              </w:rPr>
+              <w:t xml:space="preserve"> </w:t>
+            </w:r>
+            <w:r>
+              <w:rPr>
+                <w:rFonts w:ascii="Latha" w:hAnsi="Latha" w:cs="Latha"/>
+                <w:szCs w:val="24"/>
+                <w:lang w:bidi="ta-IN"/>
+              </w:rPr>
+              <w:t>|</w:t>
             </w:r>
           </w:p>
           <w:p>
@@ -669,148 +2517,256 @@
             </w:pPr>
             <w:r>
               <w:rPr>
-                <w:rFonts w:cs="BRH Devanagari Extra"/>
+                <w:rFonts w:ascii="Latha" w:hAnsi="Latha" w:cs="Latha"/>
+                <w:szCs w:val="24"/>
+                <w:cs/>
+                <w:lang w:bidi="ta-IN"/>
+              </w:rPr>
+              <w:t>ஏ</w:t>
+            </w:r>
+            <w:r>
+              <w:rPr>
+                <w:rFonts w:ascii="Latha" w:hAnsi="Latha" w:cs="Latha"/>
+                <w:szCs w:val="24"/>
+                <w:highlight w:val="green"/>
+                <w:cs/>
+                <w:lang w:bidi="ta-IN"/>
+              </w:rPr>
+              <w:t>த்ய</w:t>
+            </w:r>
+            <w:r>
+              <w:rPr>
+                <w:rFonts w:ascii="BRH Tamil Tab Extra" w:hAnsi="BRH Tamil Tab Extra" w:cs="Latha"/>
+                <w:b/>
+                <w:bCs/>
+                <w:szCs w:val="28"/>
+                <w:highlight w:val="green"/>
+                <w:lang w:bidi="ta-IN"/>
+              </w:rPr>
+              <w:t>…</w:t>
+            </w:r>
+            <w:r>
+              <w:rPr>
+                <w:rFonts w:ascii="BRH Malayalam Extra" w:hAnsi="BRH Malayalam Extra" w:cs="BRH Devanagari Extra"/>
                 <w:color w:val="000000"/>
                 <w:szCs w:val="40"/>
+                <w:highlight w:val="green"/>
                 <w:lang w:val="it-IT"/>
               </w:rPr>
-              <w:t>67</w:t>
-            </w:r>
-            <w:r>
-              <w:rPr>
-                <w:rFonts w:ascii="BRH Devanagari Extra" w:hAnsi="BRH Devanagari Extra" w:cs="BRH Devanagari Extra"/>
-                <w:color w:val="000000"/>
-                <w:sz w:val="32"/>
-                <w:szCs w:val="40"/>
-                <w:lang w:val="it-IT"/>
-              </w:rPr>
-              <w:t>)</w:t>
-            </w:r>
-            <w:r>
-              <w:rPr>
-                <w:rFonts w:ascii="BRH Devanagari Extra" w:hAnsi="BRH Devanagari Extra" w:cs="BRH Devanagari Extra"/>
-                <w:color w:val="000000"/>
-                <w:sz w:val="32"/>
-                <w:szCs w:val="40"/>
-                <w:lang w:val="it-IT"/>
+              <w:t>–</w:t>
+            </w:r>
+            <w:r>
+              <w:rPr>
+                <w:rFonts w:ascii="Latha" w:hAnsi="Latha" w:cs="Latha"/>
+                <w:szCs w:val="24"/>
+                <w:lang w:bidi="ta-IN"/>
+              </w:rPr>
+              <w:t xml:space="preserve"> </w:t>
+            </w:r>
+            <w:r>
+              <w:rPr>
+                <w:rFonts w:ascii="Latha" w:hAnsi="Latha" w:cs="Latha"/>
+                <w:szCs w:val="24"/>
+                <w:cs/>
+                <w:lang w:bidi="ta-IN"/>
+              </w:rPr>
+              <w:t>நிர் ணிரே</w:t>
+            </w:r>
+            <w:r>
+              <w:rPr>
+                <w:rFonts w:ascii="Latha" w:hAnsi="Latha" w:cs="Latha"/>
+                <w:szCs w:val="24"/>
+                <w:highlight w:val="green"/>
+                <w:cs/>
+                <w:lang w:bidi="ta-IN"/>
+              </w:rPr>
+              <w:t>த்யேத்ய</w:t>
+            </w:r>
+            <w:r>
+              <w:rPr>
+                <w:rFonts w:ascii="BRH Tamil Tab Extra" w:hAnsi="BRH Tamil Tab Extra" w:cs="Latha"/>
+                <w:b/>
+                <w:bCs/>
+                <w:szCs w:val="28"/>
+                <w:highlight w:val="green"/>
+                <w:lang w:bidi="ta-IN"/>
+              </w:rPr>
+              <w:t>…</w:t>
+            </w:r>
+            <w:r>
+              <w:rPr>
+                <w:rFonts w:ascii="Latha" w:hAnsi="Latha" w:cs="Latha"/>
+                <w:szCs w:val="24"/>
+                <w:lang w:bidi="ta-IN"/>
+              </w:rPr>
+              <w:t xml:space="preserve"> </w:t>
+            </w:r>
+            <w:r>
+              <w:rPr>
+                <w:rFonts w:ascii="Latha" w:hAnsi="Latha" w:cs="Latha"/>
+                <w:szCs w:val="24"/>
+                <w:cs/>
+                <w:lang w:bidi="ta-IN"/>
+              </w:rPr>
+              <w:t>நி</w:t>
+            </w:r>
+            <w:r>
+              <w:rPr>
+                <w:rFonts w:ascii="Latha" w:hAnsi="Latha" w:cs="Latha"/>
+                <w:b/>
+                <w:bCs/>
+                <w:szCs w:val="28"/>
+                <w:cs/>
+                <w:lang w:bidi="ta-IN"/>
+              </w:rPr>
+              <w:t>:</w:t>
+            </w:r>
+            <w:r>
+              <w:rPr>
+                <w:rFonts w:ascii="Latha" w:hAnsi="Latha" w:cs="Latha"/>
+                <w:szCs w:val="24"/>
+                <w:cs/>
+                <w:lang w:bidi="ta-IN"/>
+              </w:rPr>
+              <w:t xml:space="preserve"> </w:t>
+            </w:r>
+            <w:r>
+              <w:rPr>
+                <w:rFonts w:ascii="Latha" w:hAnsi="Latha" w:cs="Latha"/>
+                <w:szCs w:val="24"/>
+                <w:lang w:bidi="ta-IN"/>
+              </w:rPr>
+              <w:t>|</w:t>
+            </w:r>
+          </w:p>
+          <w:p>
+            <w:pPr>
+              <w:autoSpaceDE w:val="0"/>
+              <w:autoSpaceDN w:val="0"/>
+              <w:adjustRightInd w:val="0"/>
+              <w:rPr>
+                <w:rFonts w:ascii="Latha" w:hAnsi="Latha" w:cs="Latha"/>
+                <w:szCs w:val="24"/>
+                <w:lang w:bidi="ta-IN"/>
+              </w:rPr>
+            </w:pPr>
+            <w:r>
+              <w:rPr>
+                <w:rFonts w:ascii="Latha" w:hAnsi="Latha" w:cs="Latha"/>
+                <w:b/>
+                <w:bCs/>
+                <w:szCs w:val="24"/>
+                <w:cs/>
+                <w:lang w:bidi="ta-IN"/>
+              </w:rPr>
+              <w:t>67)</w:t>
+            </w:r>
+            <w:r>
+              <w:rPr>
+                <w:rFonts w:ascii="Latha" w:hAnsi="Latha" w:cs="Latha"/>
+                <w:szCs w:val="24"/>
+                <w:lang w:bidi="ta-IN"/>
               </w:rPr>
               <w:tab/>
             </w:r>
             <w:r>
               <w:rPr>
-                <w:rFonts w:cs="BRH Devanagari Extra"/>
-                <w:color w:val="000000"/>
-                <w:szCs w:val="40"/>
-                <w:lang w:val="it-IT"/>
-              </w:rPr>
-              <w:t>2</w:t>
-            </w:r>
-            <w:r>
-              <w:rPr>
-                <w:rFonts w:ascii="BRH Devanagari Extra" w:hAnsi="BRH Devanagari Extra" w:cs="BRH Devanagari Extra"/>
-                <w:color w:val="000000"/>
-                <w:sz w:val="32"/>
-                <w:szCs w:val="40"/>
-                <w:lang w:val="it-IT"/>
+                <w:rFonts w:ascii="Latha" w:hAnsi="Latha" w:cs="Latha"/>
+                <w:b/>
+                <w:bCs/>
+                <w:szCs w:val="24"/>
+                <w:cs/>
+                <w:lang w:bidi="ta-IN"/>
+              </w:rPr>
+              <w:t>2.3</w:t>
+            </w:r>
+            <w:r>
+              <w:rPr>
+                <w:rFonts w:ascii="Latha" w:hAnsi="Latha" w:cs="Latha"/>
+                <w:b/>
+                <w:bCs/>
+                <w:szCs w:val="24"/>
+                <w:lang w:bidi="ta-IN"/>
               </w:rPr>
               <w:t>.</w:t>
             </w:r>
             <w:r>
               <w:rPr>
-                <w:rFonts w:cs="BRH Devanagari Extra"/>
-                <w:color w:val="000000"/>
-                <w:szCs w:val="40"/>
-                <w:lang w:val="it-IT"/>
-              </w:rPr>
-              <w:t>3</w:t>
-            </w:r>
-            <w:r>
-              <w:rPr>
-                <w:rFonts w:ascii="BRH Devanagari Extra" w:hAnsi="BRH Devanagari Extra" w:cs="BRH Devanagari Extra"/>
-                <w:color w:val="000000"/>
-                <w:sz w:val="32"/>
-                <w:szCs w:val="40"/>
-                <w:lang w:val="it-IT"/>
-              </w:rPr>
-              <w:t>.</w:t>
-            </w:r>
-            <w:r>
-              <w:rPr>
-                <w:rFonts w:cs="BRH Devanagari Extra"/>
-                <w:color w:val="000000"/>
-                <w:szCs w:val="40"/>
-                <w:lang w:val="it-IT"/>
+                <w:rFonts w:ascii="Latha" w:hAnsi="Latha" w:cs="Latha"/>
+                <w:b/>
+                <w:bCs/>
+                <w:szCs w:val="24"/>
+                <w:cs/>
+                <w:lang w:bidi="ta-IN"/>
               </w:rPr>
               <w:t>12</w:t>
             </w:r>
             <w:r>
               <w:rPr>
-                <w:rFonts w:ascii="BRH Devanagari Extra" w:hAnsi="BRH Devanagari Extra" w:cs="BRH Devanagari Extra"/>
-                <w:color w:val="000000"/>
-                <w:sz w:val="32"/>
-                <w:szCs w:val="40"/>
-                <w:lang w:val="it-IT"/>
-              </w:rPr>
-              <w:t>.</w:t>
-            </w:r>
-            <w:r>
-              <w:rPr>
-                <w:rFonts w:cs="BRH Devanagari Extra"/>
-                <w:color w:val="000000"/>
-                <w:szCs w:val="40"/>
-                <w:lang w:val="it-IT"/>
-              </w:rPr>
-              <w:t>2</w:t>
-            </w:r>
-            <w:r>
-              <w:rPr>
-                <w:rFonts w:ascii="BRH Devanagari Extra" w:hAnsi="BRH Devanagari Extra" w:cs="BRH Devanagari Extra"/>
-                <w:color w:val="000000"/>
-                <w:sz w:val="32"/>
-                <w:szCs w:val="40"/>
-                <w:lang w:val="it-IT"/>
+                <w:rFonts w:ascii="Latha" w:hAnsi="Latha" w:cs="Latha"/>
+                <w:b/>
+                <w:bCs/>
+                <w:szCs w:val="24"/>
+                <w:lang w:bidi="ta-IN"/>
+              </w:rPr>
+              <w:t>.2</w:t>
+            </w:r>
+            <w:r>
+              <w:rPr>
+                <w:rFonts w:ascii="Latha" w:hAnsi="Latha" w:cs="Latha"/>
+                <w:b/>
+                <w:bCs/>
+                <w:szCs w:val="24"/>
+                <w:lang w:bidi="ta-IN"/>
               </w:rPr>
               <w:t>(</w:t>
             </w:r>
             <w:r>
               <w:rPr>
-                <w:rFonts w:cs="BRH Devanagari Extra"/>
-                <w:color w:val="000000"/>
-                <w:szCs w:val="40"/>
-                <w:lang w:val="it-IT"/>
-              </w:rPr>
-              <w:t>52</w:t>
-            </w:r>
-            <w:r>
-              <w:rPr>
-                <w:rFonts w:ascii="BRH Devanagari Extra" w:hAnsi="BRH Devanagari Extra" w:cs="BRH Devanagari Extra"/>
-                <w:color w:val="000000"/>
-                <w:sz w:val="32"/>
-                <w:szCs w:val="40"/>
-                <w:lang w:val="it-IT"/>
-              </w:rPr>
-              <w:t>)-  L</w:t>
-            </w:r>
-            <w:r>
-              <w:rPr>
-                <w:rFonts w:ascii="BRH Devanagari Extra" w:hAnsi="BRH Devanagari Extra" w:cs="BRH Devanagari Extra"/>
-                <w:color w:val="000000"/>
-                <w:sz w:val="32"/>
-                <w:szCs w:val="40"/>
-                <w:highlight w:val="yellow"/>
-                <w:lang w:val="it-IT"/>
-              </w:rPr>
-              <w:t>irÉå</w:t>
-            </w:r>
-            <w:r>
-              <w:rPr>
-                <w:rFonts w:ascii="BRH Devanagari Extra" w:hAnsi="BRH Devanagari Extra" w:cs="BRH Devanagari Extra"/>
-                <w:color w:val="000000"/>
-                <w:sz w:val="32"/>
-                <w:szCs w:val="40"/>
-                <w:lang w:val="it-IT"/>
-              </w:rPr>
-              <w:t>irÉþ |</w:t>
+                <w:rFonts w:ascii="Latha" w:hAnsi="Latha" w:cs="Latha"/>
+                <w:b/>
+                <w:bCs/>
+                <w:szCs w:val="24"/>
+                <w:cs/>
+                <w:lang w:bidi="ta-IN"/>
+              </w:rPr>
+              <w:t>52)</w:t>
+            </w:r>
+            <w:r>
+              <w:rPr>
+                <w:rFonts w:ascii="Latha" w:hAnsi="Latha" w:cs="Latha"/>
+                <w:szCs w:val="24"/>
+                <w:lang w:bidi="ta-IN"/>
+              </w:rPr>
+              <w:t xml:space="preserve">-  </w:t>
+            </w:r>
+            <w:r>
+              <w:rPr>
+                <w:rFonts w:ascii="Latha" w:hAnsi="Latha" w:cs="Latha"/>
+                <w:szCs w:val="24"/>
+                <w:highlight w:val="green"/>
+                <w:cs/>
+                <w:lang w:bidi="ta-IN"/>
+              </w:rPr>
+              <w:t>ஏத்ய</w:t>
+            </w:r>
+            <w:r>
+              <w:rPr>
+                <w:rFonts w:ascii="BRH Tamil Tab Extra" w:hAnsi="BRH Tamil Tab Extra" w:cs="Latha"/>
+                <w:b/>
+                <w:bCs/>
+                <w:szCs w:val="28"/>
+                <w:lang w:bidi="ta-IN"/>
+              </w:rPr>
+              <w:t>†</w:t>
+            </w:r>
+            <w:r>
+              <w:rPr>
+                <w:rFonts w:ascii="Latha" w:hAnsi="Latha" w:cs="Latha"/>
+                <w:szCs w:val="24"/>
+                <w:lang w:bidi="ta-IN"/>
+              </w:rPr>
+              <w:t xml:space="preserve"> |</w:t>
             </w:r>
           </w:p>
           <w:p>
@@ -826,1241 +2782,119 @@
                 <w:bCs/>
                 <w:szCs w:val="24"/>
                 <w:cs/>
-                <w:lang w:bidi="ta-IN"/>
+                <w:lang w:val="it-IT" w:bidi="ta-IN"/>
               </w:rPr>
             </w:pPr>
             <w:r>
               <w:rPr>
-                <w:rFonts w:ascii="BRH Devanagari Extra" w:hAnsi="BRH Devanagari Extra" w:cs="BRH Devanagari Extra"/>
-                <w:color w:val="000000"/>
-                <w:sz w:val="32"/>
-                <w:szCs w:val="40"/>
-                <w:lang w:val="it-IT"/>
-              </w:rPr>
-              <w:t xml:space="preserve">LirÉåirÉÉÿ - CirÉþ | </w:t>
-            </w:r>
-          </w:p>
-        </w:tc>
-        <w:tc>
-          <w:tcPr>
-            <w:tcW w:w="7371" w:type="dxa"/>
-          </w:tcPr>
-          <w:p>
-            <w:pPr>
-              <w:widowControl w:val="0"/>
-              <w:autoSpaceDE w:val="0"/>
-              <w:autoSpaceDN w:val="0"/>
-              <w:adjustRightInd w:val="0"/>
-              <w:spacing w:before="0" w:line="240" w:lineRule="auto"/>
-              <w:rPr>
-                <w:rFonts w:ascii="BRH Devanagari Extra" w:hAnsi="BRH Devanagari Extra" w:cs="BRH Devanagari Extra"/>
-                <w:color w:val="000000"/>
-                <w:sz w:val="32"/>
-                <w:szCs w:val="40"/>
-                <w:lang w:val="it-IT"/>
-              </w:rPr>
-            </w:pPr>
-            <w:r>
-              <w:rPr>
-                <w:rFonts w:cs="BRH Devanagari Extra"/>
-                <w:color w:val="000000"/>
-                <w:szCs w:val="40"/>
-                <w:lang w:val="it-IT"/>
-              </w:rPr>
-              <w:t>65</w:t>
-            </w:r>
-            <w:r>
-              <w:rPr>
-                <w:rFonts w:ascii="BRH Devanagari Extra" w:hAnsi="BRH Devanagari Extra" w:cs="BRH Devanagari Extra"/>
-                <w:color w:val="000000"/>
-                <w:sz w:val="32"/>
-                <w:szCs w:val="40"/>
-                <w:lang w:val="it-IT"/>
-              </w:rPr>
-              <w:t>)</w:t>
-            </w:r>
-            <w:r>
-              <w:rPr>
-                <w:rFonts w:ascii="BRH Devanagari Extra" w:hAnsi="BRH Devanagari Extra" w:cs="BRH Devanagari Extra"/>
-                <w:color w:val="000000"/>
-                <w:sz w:val="32"/>
-                <w:szCs w:val="40"/>
-                <w:lang w:val="it-IT"/>
-              </w:rPr>
-              <w:tab/>
-            </w:r>
-            <w:r>
-              <w:rPr>
-                <w:rFonts w:cs="BRH Devanagari Extra"/>
-                <w:color w:val="000000"/>
-                <w:szCs w:val="40"/>
-                <w:lang w:val="it-IT"/>
-              </w:rPr>
-              <w:t>2</w:t>
-            </w:r>
-            <w:r>
-              <w:rPr>
-                <w:rFonts w:ascii="BRH Devanagari Extra" w:hAnsi="BRH Devanagari Extra" w:cs="BRH Devanagari Extra"/>
-                <w:color w:val="000000"/>
-                <w:sz w:val="32"/>
-                <w:szCs w:val="40"/>
-                <w:lang w:val="it-IT"/>
-              </w:rPr>
-              <w:t>.</w:t>
-            </w:r>
-            <w:r>
-              <w:rPr>
-                <w:rFonts w:cs="BRH Devanagari Extra"/>
-                <w:color w:val="000000"/>
-                <w:szCs w:val="40"/>
-                <w:lang w:val="it-IT"/>
-              </w:rPr>
-              <w:t>3</w:t>
-            </w:r>
-            <w:r>
-              <w:rPr>
-                <w:rFonts w:ascii="BRH Devanagari Extra" w:hAnsi="BRH Devanagari Extra" w:cs="BRH Devanagari Extra"/>
-                <w:color w:val="000000"/>
-                <w:sz w:val="32"/>
-                <w:szCs w:val="40"/>
-                <w:lang w:val="it-IT"/>
-              </w:rPr>
-              <w:t>.</w:t>
-            </w:r>
-            <w:r>
-              <w:rPr>
-                <w:rFonts w:cs="BRH Devanagari Extra"/>
-                <w:color w:val="000000"/>
-                <w:szCs w:val="40"/>
-                <w:lang w:val="it-IT"/>
-              </w:rPr>
-              <w:t>12</w:t>
-            </w:r>
-            <w:r>
-              <w:rPr>
-                <w:rFonts w:ascii="BRH Devanagari Extra" w:hAnsi="BRH Devanagari Extra" w:cs="BRH Devanagari Extra"/>
-                <w:color w:val="000000"/>
-                <w:sz w:val="32"/>
-                <w:szCs w:val="40"/>
-                <w:lang w:val="it-IT"/>
-              </w:rPr>
-              <w:t>.</w:t>
-            </w:r>
-            <w:r>
-              <w:rPr>
-                <w:rFonts w:cs="BRH Devanagari Extra"/>
-                <w:color w:val="000000"/>
-                <w:szCs w:val="40"/>
-                <w:lang w:val="it-IT"/>
-              </w:rPr>
-              <w:t>2</w:t>
-            </w:r>
-            <w:r>
-              <w:rPr>
-                <w:rFonts w:ascii="BRH Devanagari Extra" w:hAnsi="BRH Devanagari Extra" w:cs="BRH Devanagari Extra"/>
-                <w:color w:val="000000"/>
-                <w:sz w:val="32"/>
-                <w:szCs w:val="40"/>
-                <w:lang w:val="it-IT"/>
-              </w:rPr>
-              <w:t>(</w:t>
-            </w:r>
-            <w:r>
-              <w:rPr>
-                <w:rFonts w:cs="BRH Devanagari Extra"/>
-                <w:color w:val="000000"/>
-                <w:szCs w:val="40"/>
-                <w:lang w:val="it-IT"/>
-              </w:rPr>
-              <w:t>51</w:t>
-            </w:r>
-            <w:r>
-              <w:rPr>
-                <w:rFonts w:ascii="BRH Devanagari Extra" w:hAnsi="BRH Devanagari Extra" w:cs="BRH Devanagari Extra"/>
-                <w:color w:val="000000"/>
-                <w:sz w:val="32"/>
-                <w:szCs w:val="40"/>
-                <w:lang w:val="it-IT"/>
-              </w:rPr>
-              <w:t>)-  mÉÑlÉþÈ | L</w:t>
-            </w:r>
-            <w:r>
-              <w:rPr>
-                <w:rFonts w:ascii="BRH Devanagari Extra" w:hAnsi="BRH Devanagari Extra" w:cs="BRH Devanagari Extra"/>
-                <w:color w:val="000000"/>
-                <w:sz w:val="32"/>
-                <w:szCs w:val="40"/>
-                <w:highlight w:val="green"/>
-                <w:lang w:val="it-IT"/>
-              </w:rPr>
-              <w:t>irÉ</w:t>
-            </w:r>
-            <w:r>
-              <w:rPr>
-                <w:rFonts w:ascii="BRH Devanagari Extra" w:hAnsi="BRH Devanagari Extra" w:cs="BRH Devanagari Extra"/>
-                <w:color w:val="000000"/>
-                <w:sz w:val="32"/>
-                <w:szCs w:val="40"/>
-                <w:lang w:val="it-IT"/>
-              </w:rPr>
-              <w:t>þ |</w:t>
-            </w:r>
-          </w:p>
-          <w:p>
-            <w:pPr>
-              <w:widowControl w:val="0"/>
-              <w:autoSpaceDE w:val="0"/>
-              <w:autoSpaceDN w:val="0"/>
-              <w:adjustRightInd w:val="0"/>
-              <w:spacing w:before="0" w:line="240" w:lineRule="auto"/>
-              <w:rPr>
-                <w:rFonts w:ascii="BRH Devanagari Extra" w:hAnsi="BRH Devanagari Extra" w:cs="BRH Devanagari Extra"/>
-                <w:color w:val="000000"/>
-                <w:sz w:val="32"/>
-                <w:szCs w:val="40"/>
-                <w:lang w:val="it-IT"/>
-              </w:rPr>
-            </w:pPr>
-            <w:r>
-              <w:rPr>
-                <w:rFonts w:ascii="BRH Devanagari Extra" w:hAnsi="BRH Devanagari Extra" w:cs="BRH Devanagari Extra"/>
-                <w:color w:val="000000"/>
-                <w:sz w:val="32"/>
-                <w:szCs w:val="40"/>
-                <w:lang w:val="it-IT"/>
-              </w:rPr>
-              <w:t>mÉÑlÉ</w:t>
-            </w:r>
-            <w:r>
-              <w:rPr>
-                <w:rFonts w:ascii="BRH Malayalam Extra" w:hAnsi="BRH Malayalam Extra" w:cs="BRH Devanagari Extra"/>
-                <w:color w:val="000000"/>
-                <w:szCs w:val="40"/>
-                <w:lang w:val="it-IT"/>
-              </w:rPr>
-              <w:t>–</w:t>
-            </w:r>
-            <w:r>
-              <w:rPr>
-                <w:rFonts w:ascii="BRH Devanagari Extra" w:hAnsi="BRH Devanagari Extra" w:cs="BRH Devanagari Extra"/>
-                <w:color w:val="000000"/>
-                <w:sz w:val="32"/>
-                <w:szCs w:val="40"/>
-                <w:lang w:val="it-IT"/>
-              </w:rPr>
-              <w:t xml:space="preserve"> </w:t>
-            </w:r>
-            <w:r>
-              <w:rPr>
-                <w:rFonts w:ascii="BRH Devanagari Extra" w:hAnsi="BRH Devanagari Extra" w:cs="BRH Devanagari Extra"/>
-                <w:color w:val="000000"/>
-                <w:sz w:val="32"/>
-                <w:szCs w:val="40"/>
-                <w:highlight w:val="green"/>
-                <w:lang w:val="it-IT"/>
-              </w:rPr>
-              <w:t>UåirÉåirÉ</w:t>
-            </w:r>
-            <w:r>
-              <w:rPr>
-                <w:rFonts w:ascii="BRH Malayalam Extra" w:hAnsi="BRH Malayalam Extra" w:cs="BRH Devanagari Extra"/>
-                <w:color w:val="000000"/>
-                <w:szCs w:val="40"/>
-                <w:lang w:val="it-IT"/>
-              </w:rPr>
-              <w:t>–</w:t>
-            </w:r>
-            <w:r>
-              <w:rPr>
-                <w:rFonts w:ascii="BRH Devanagari Extra" w:hAnsi="BRH Devanagari Extra" w:cs="BRH Devanagari Extra"/>
-                <w:color w:val="000000"/>
-                <w:sz w:val="32"/>
-                <w:szCs w:val="40"/>
-                <w:lang w:val="it-IT"/>
-              </w:rPr>
-              <w:t xml:space="preserve"> mÉÑlÉ</w:t>
-            </w:r>
-            <w:r>
-              <w:rPr>
-                <w:rFonts w:ascii="BRH Malayalam Extra" w:hAnsi="BRH Malayalam Extra" w:cs="BRH Devanagari Extra"/>
-                <w:color w:val="000000"/>
-                <w:szCs w:val="40"/>
-                <w:lang w:val="it-IT"/>
-              </w:rPr>
-              <w:t>–</w:t>
-            </w:r>
-            <w:r>
-              <w:rPr>
-                <w:rFonts w:ascii="BRH Devanagari Extra" w:hAnsi="BRH Devanagari Extra" w:cs="BRH Devanagari Extra"/>
-                <w:color w:val="000000"/>
-                <w:sz w:val="32"/>
-                <w:szCs w:val="40"/>
-                <w:lang w:val="it-IT"/>
-              </w:rPr>
-              <w:t>È mÉÑlÉ</w:t>
-            </w:r>
-            <w:r>
-              <w:rPr>
-                <w:rFonts w:ascii="BRH Malayalam Extra" w:hAnsi="BRH Malayalam Extra" w:cs="BRH Devanagari Extra"/>
-                <w:color w:val="000000"/>
-                <w:szCs w:val="40"/>
-                <w:highlight w:val="green"/>
-                <w:lang w:val="it-IT"/>
-              </w:rPr>
-              <w:t>–</w:t>
-            </w:r>
-            <w:r>
-              <w:rPr>
-                <w:rFonts w:ascii="BRH Devanagari Extra" w:hAnsi="BRH Devanagari Extra" w:cs="BRH Devanagari Extra"/>
-                <w:color w:val="000000"/>
-                <w:sz w:val="32"/>
-                <w:szCs w:val="40"/>
-                <w:highlight w:val="green"/>
-                <w:lang w:val="it-IT"/>
-              </w:rPr>
-              <w:t xml:space="preserve"> UåirÉþ</w:t>
-            </w:r>
-            <w:r>
-              <w:rPr>
-                <w:rFonts w:ascii="BRH Devanagari Extra" w:hAnsi="BRH Devanagari Extra" w:cs="BRH Devanagari Extra"/>
-                <w:color w:val="000000"/>
-                <w:sz w:val="32"/>
-                <w:szCs w:val="40"/>
-                <w:lang w:val="it-IT"/>
-              </w:rPr>
-              <w:t xml:space="preserve"> | </w:t>
-            </w:r>
-          </w:p>
-          <w:p>
-            <w:pPr>
-              <w:widowControl w:val="0"/>
-              <w:autoSpaceDE w:val="0"/>
-              <w:autoSpaceDN w:val="0"/>
-              <w:adjustRightInd w:val="0"/>
-              <w:spacing w:before="0" w:line="240" w:lineRule="auto"/>
-              <w:rPr>
-                <w:rFonts w:ascii="BRH Devanagari Extra" w:hAnsi="BRH Devanagari Extra" w:cs="BRH Devanagari Extra"/>
-                <w:color w:val="000000"/>
-                <w:sz w:val="32"/>
-                <w:szCs w:val="40"/>
-                <w:lang w:val="it-IT"/>
-              </w:rPr>
-            </w:pPr>
-            <w:r>
-              <w:rPr>
-                <w:rFonts w:cs="BRH Devanagari Extra"/>
-                <w:color w:val="000000"/>
-                <w:szCs w:val="40"/>
-                <w:lang w:val="it-IT"/>
-              </w:rPr>
-              <w:t>66</w:t>
-            </w:r>
-            <w:r>
-              <w:rPr>
-                <w:rFonts w:ascii="BRH Devanagari Extra" w:hAnsi="BRH Devanagari Extra" w:cs="BRH Devanagari Extra"/>
-                <w:color w:val="000000"/>
-                <w:sz w:val="32"/>
-                <w:szCs w:val="40"/>
-                <w:lang w:val="it-IT"/>
-              </w:rPr>
-              <w:t>)</w:t>
-            </w:r>
-            <w:r>
-              <w:rPr>
-                <w:rFonts w:ascii="BRH Devanagari Extra" w:hAnsi="BRH Devanagari Extra" w:cs="BRH Devanagari Extra"/>
-                <w:color w:val="000000"/>
-                <w:sz w:val="32"/>
-                <w:szCs w:val="40"/>
-                <w:lang w:val="it-IT"/>
-              </w:rPr>
-              <w:tab/>
-            </w:r>
-            <w:r>
-              <w:rPr>
-                <w:rFonts w:cs="BRH Devanagari Extra"/>
-                <w:color w:val="000000"/>
-                <w:szCs w:val="40"/>
-                <w:lang w:val="it-IT"/>
-              </w:rPr>
-              <w:t>2</w:t>
-            </w:r>
-            <w:r>
-              <w:rPr>
-                <w:rFonts w:ascii="BRH Devanagari Extra" w:hAnsi="BRH Devanagari Extra" w:cs="BRH Devanagari Extra"/>
-                <w:color w:val="000000"/>
-                <w:sz w:val="32"/>
-                <w:szCs w:val="40"/>
-                <w:lang w:val="it-IT"/>
-              </w:rPr>
-              <w:t>.</w:t>
-            </w:r>
-            <w:r>
-              <w:rPr>
-                <w:rFonts w:cs="BRH Devanagari Extra"/>
-                <w:color w:val="000000"/>
-                <w:szCs w:val="40"/>
-                <w:lang w:val="it-IT"/>
-              </w:rPr>
-              <w:t>3</w:t>
-            </w:r>
-            <w:r>
-              <w:rPr>
-                <w:rFonts w:ascii="BRH Devanagari Extra" w:hAnsi="BRH Devanagari Extra" w:cs="BRH Devanagari Extra"/>
-                <w:color w:val="000000"/>
-                <w:sz w:val="32"/>
-                <w:szCs w:val="40"/>
-                <w:lang w:val="it-IT"/>
-              </w:rPr>
-              <w:t>.</w:t>
-            </w:r>
-            <w:r>
-              <w:rPr>
-                <w:rFonts w:cs="BRH Devanagari Extra"/>
-                <w:color w:val="000000"/>
-                <w:szCs w:val="40"/>
-                <w:lang w:val="it-IT"/>
-              </w:rPr>
-              <w:t>12</w:t>
-            </w:r>
-            <w:r>
-              <w:rPr>
-                <w:rFonts w:ascii="BRH Devanagari Extra" w:hAnsi="BRH Devanagari Extra" w:cs="BRH Devanagari Extra"/>
-                <w:color w:val="000000"/>
-                <w:sz w:val="32"/>
-                <w:szCs w:val="40"/>
-                <w:lang w:val="it-IT"/>
-              </w:rPr>
-              <w:t>.</w:t>
-            </w:r>
-            <w:r>
-              <w:rPr>
-                <w:rFonts w:cs="BRH Devanagari Extra"/>
-                <w:color w:val="000000"/>
-                <w:szCs w:val="40"/>
-                <w:lang w:val="it-IT"/>
-              </w:rPr>
-              <w:t>2</w:t>
-            </w:r>
-            <w:r>
-              <w:rPr>
-                <w:rFonts w:ascii="BRH Devanagari Extra" w:hAnsi="BRH Devanagari Extra" w:cs="BRH Devanagari Extra"/>
-                <w:color w:val="000000"/>
-                <w:sz w:val="32"/>
-                <w:szCs w:val="40"/>
-                <w:lang w:val="it-IT"/>
-              </w:rPr>
-              <w:t>(</w:t>
-            </w:r>
-            <w:r>
-              <w:rPr>
-                <w:rFonts w:cs="BRH Devanagari Extra"/>
-                <w:color w:val="000000"/>
-                <w:szCs w:val="40"/>
-                <w:lang w:val="it-IT"/>
-              </w:rPr>
-              <w:t>52</w:t>
-            </w:r>
-            <w:r>
-              <w:rPr>
-                <w:rFonts w:ascii="BRH Devanagari Extra" w:hAnsi="BRH Devanagari Extra" w:cs="BRH Devanagari Extra"/>
-                <w:color w:val="000000"/>
-                <w:sz w:val="32"/>
-                <w:szCs w:val="40"/>
-                <w:lang w:val="it-IT"/>
-              </w:rPr>
-              <w:t>)-  L</w:t>
-            </w:r>
-            <w:r>
-              <w:rPr>
-                <w:rFonts w:ascii="BRH Devanagari Extra" w:hAnsi="BRH Devanagari Extra" w:cs="BRH Devanagari Extra"/>
-                <w:color w:val="000000"/>
-                <w:sz w:val="32"/>
-                <w:szCs w:val="40"/>
-                <w:highlight w:val="green"/>
-                <w:lang w:val="it-IT"/>
-              </w:rPr>
-              <w:t>irÉ</w:t>
-            </w:r>
-            <w:r>
-              <w:rPr>
-                <w:rFonts w:ascii="BRH Devanagari Extra" w:hAnsi="BRH Devanagari Extra" w:cs="BRH Devanagari Extra"/>
-                <w:color w:val="000000"/>
-                <w:sz w:val="32"/>
-                <w:szCs w:val="40"/>
-                <w:lang w:val="it-IT"/>
-              </w:rPr>
-              <w:t>þ | ÌlÉÈ |</w:t>
-            </w:r>
-          </w:p>
-          <w:p>
-            <w:pPr>
-              <w:widowControl w:val="0"/>
-              <w:autoSpaceDE w:val="0"/>
-              <w:autoSpaceDN w:val="0"/>
-              <w:adjustRightInd w:val="0"/>
-              <w:spacing w:before="0" w:line="240" w:lineRule="auto"/>
-              <w:rPr>
-                <w:rFonts w:ascii="BRH Devanagari Extra" w:hAnsi="BRH Devanagari Extra" w:cs="BRH Devanagari Extra"/>
-                <w:color w:val="000000"/>
-                <w:sz w:val="32"/>
-                <w:szCs w:val="40"/>
-                <w:lang w:val="it-IT"/>
-              </w:rPr>
-            </w:pPr>
-            <w:r>
-              <w:rPr>
-                <w:rFonts w:ascii="BRH Devanagari Extra" w:hAnsi="BRH Devanagari Extra" w:cs="BRH Devanagari Extra"/>
-                <w:color w:val="000000"/>
-                <w:sz w:val="32"/>
-                <w:szCs w:val="40"/>
-                <w:lang w:val="it-IT"/>
-              </w:rPr>
-              <w:t>L</w:t>
-            </w:r>
-            <w:r>
-              <w:rPr>
-                <w:rFonts w:ascii="BRH Devanagari Extra" w:hAnsi="BRH Devanagari Extra" w:cs="BRH Devanagari Extra"/>
-                <w:color w:val="000000"/>
-                <w:sz w:val="32"/>
-                <w:szCs w:val="40"/>
-                <w:highlight w:val="green"/>
-                <w:lang w:val="it-IT"/>
-              </w:rPr>
-              <w:t>irÉ</w:t>
-            </w:r>
-            <w:r>
-              <w:rPr>
-                <w:rFonts w:ascii="BRH Malayalam Extra" w:hAnsi="BRH Malayalam Extra" w:cs="BRH Devanagari Extra"/>
-                <w:color w:val="000000"/>
-                <w:szCs w:val="40"/>
-                <w:highlight w:val="green"/>
-                <w:lang w:val="it-IT"/>
-              </w:rPr>
-              <w:t>–</w:t>
-            </w:r>
-            <w:r>
-              <w:rPr>
-                <w:rFonts w:ascii="BRH Devanagari Extra" w:hAnsi="BRH Devanagari Extra" w:cs="BRH Devanagari Extra"/>
-                <w:color w:val="000000"/>
-                <w:sz w:val="32"/>
-                <w:szCs w:val="40"/>
-                <w:lang w:val="it-IT"/>
-              </w:rPr>
-              <w:t xml:space="preserve"> ÌlÉUç ÍhÉUåirÉå</w:t>
-            </w:r>
-            <w:r>
-              <w:rPr>
-                <w:rFonts w:ascii="BRH Devanagari Extra" w:hAnsi="BRH Devanagari Extra" w:cs="BRH Devanagari Extra"/>
-                <w:color w:val="000000"/>
-                <w:sz w:val="32"/>
-                <w:szCs w:val="40"/>
-                <w:highlight w:val="green"/>
-                <w:lang w:val="it-IT"/>
-              </w:rPr>
-              <w:t>åirÉ</w:t>
-            </w:r>
-            <w:r>
-              <w:rPr>
-                <w:rFonts w:ascii="BRH Malayalam Extra" w:hAnsi="BRH Malayalam Extra" w:cs="BRH Devanagari Extra"/>
-                <w:color w:val="000000"/>
-                <w:szCs w:val="40"/>
-                <w:lang w:val="it-IT"/>
-              </w:rPr>
-              <w:t>–</w:t>
-            </w:r>
-            <w:r>
-              <w:rPr>
-                <w:rFonts w:ascii="BRH Devanagari Extra" w:hAnsi="BRH Devanagari Extra" w:cs="BRH Devanagari Extra"/>
-                <w:color w:val="000000"/>
-                <w:sz w:val="32"/>
-                <w:szCs w:val="40"/>
-                <w:lang w:val="it-IT"/>
-              </w:rPr>
-              <w:t xml:space="preserve"> ÌlÉÈ | </w:t>
-            </w:r>
-          </w:p>
-          <w:p>
-            <w:pPr>
-              <w:widowControl w:val="0"/>
-              <w:autoSpaceDE w:val="0"/>
-              <w:autoSpaceDN w:val="0"/>
-              <w:adjustRightInd w:val="0"/>
-              <w:spacing w:before="0" w:line="240" w:lineRule="auto"/>
-              <w:rPr>
-                <w:rFonts w:ascii="BRH Devanagari Extra" w:hAnsi="BRH Devanagari Extra" w:cs="BRH Devanagari Extra"/>
-                <w:color w:val="000000"/>
-                <w:sz w:val="32"/>
-                <w:szCs w:val="40"/>
-                <w:lang w:val="it-IT"/>
-              </w:rPr>
-            </w:pPr>
-            <w:r>
-              <w:rPr>
-                <w:rFonts w:cs="BRH Devanagari Extra"/>
-                <w:color w:val="000000"/>
-                <w:szCs w:val="40"/>
-                <w:lang w:val="it-IT"/>
-              </w:rPr>
-              <w:t>67</w:t>
-            </w:r>
-            <w:r>
-              <w:rPr>
-                <w:rFonts w:ascii="BRH Devanagari Extra" w:hAnsi="BRH Devanagari Extra" w:cs="BRH Devanagari Extra"/>
-                <w:color w:val="000000"/>
-                <w:sz w:val="32"/>
-                <w:szCs w:val="40"/>
-                <w:lang w:val="it-IT"/>
-              </w:rPr>
-              <w:t>)</w:t>
-            </w:r>
-            <w:r>
-              <w:rPr>
-                <w:rFonts w:ascii="BRH Devanagari Extra" w:hAnsi="BRH Devanagari Extra" w:cs="BRH Devanagari Extra"/>
-                <w:color w:val="000000"/>
-                <w:sz w:val="32"/>
-                <w:szCs w:val="40"/>
-                <w:lang w:val="it-IT"/>
-              </w:rPr>
-              <w:tab/>
-            </w:r>
-            <w:r>
-              <w:rPr>
-                <w:rFonts w:cs="BRH Devanagari Extra"/>
-                <w:color w:val="000000"/>
-                <w:szCs w:val="40"/>
-                <w:lang w:val="it-IT"/>
-              </w:rPr>
-              <w:t>2</w:t>
-            </w:r>
-            <w:r>
-              <w:rPr>
-                <w:rFonts w:ascii="BRH Devanagari Extra" w:hAnsi="BRH Devanagari Extra" w:cs="BRH Devanagari Extra"/>
-                <w:color w:val="000000"/>
-                <w:sz w:val="32"/>
-                <w:szCs w:val="40"/>
-                <w:lang w:val="it-IT"/>
-              </w:rPr>
-              <w:t>.</w:t>
-            </w:r>
-            <w:r>
-              <w:rPr>
-                <w:rFonts w:cs="BRH Devanagari Extra"/>
-                <w:color w:val="000000"/>
-                <w:szCs w:val="40"/>
-                <w:lang w:val="it-IT"/>
-              </w:rPr>
-              <w:t>3</w:t>
-            </w:r>
-            <w:r>
-              <w:rPr>
-                <w:rFonts w:ascii="BRH Devanagari Extra" w:hAnsi="BRH Devanagari Extra" w:cs="BRH Devanagari Extra"/>
-                <w:color w:val="000000"/>
-                <w:sz w:val="32"/>
-                <w:szCs w:val="40"/>
-                <w:lang w:val="it-IT"/>
-              </w:rPr>
-              <w:t>.</w:t>
-            </w:r>
-            <w:r>
-              <w:rPr>
-                <w:rFonts w:cs="BRH Devanagari Extra"/>
-                <w:color w:val="000000"/>
-                <w:szCs w:val="40"/>
-                <w:lang w:val="it-IT"/>
-              </w:rPr>
-              <w:t>12</w:t>
-            </w:r>
-            <w:r>
-              <w:rPr>
-                <w:rFonts w:ascii="BRH Devanagari Extra" w:hAnsi="BRH Devanagari Extra" w:cs="BRH Devanagari Extra"/>
-                <w:color w:val="000000"/>
-                <w:sz w:val="32"/>
-                <w:szCs w:val="40"/>
-                <w:lang w:val="it-IT"/>
-              </w:rPr>
-              <w:t>.</w:t>
-            </w:r>
-            <w:r>
-              <w:rPr>
-                <w:rFonts w:cs="BRH Devanagari Extra"/>
-                <w:color w:val="000000"/>
-                <w:szCs w:val="40"/>
-                <w:lang w:val="it-IT"/>
-              </w:rPr>
-              <w:t>2</w:t>
-            </w:r>
-            <w:r>
-              <w:rPr>
-                <w:rFonts w:ascii="BRH Devanagari Extra" w:hAnsi="BRH Devanagari Extra" w:cs="BRH Devanagari Extra"/>
-                <w:color w:val="000000"/>
-                <w:sz w:val="32"/>
-                <w:szCs w:val="40"/>
-                <w:lang w:val="it-IT"/>
-              </w:rPr>
-              <w:t>(</w:t>
-            </w:r>
-            <w:r>
-              <w:rPr>
-                <w:rFonts w:cs="BRH Devanagari Extra"/>
-                <w:color w:val="000000"/>
-                <w:szCs w:val="40"/>
-                <w:lang w:val="it-IT"/>
-              </w:rPr>
-              <w:t>52</w:t>
-            </w:r>
-            <w:r>
-              <w:rPr>
-                <w:rFonts w:ascii="BRH Devanagari Extra" w:hAnsi="BRH Devanagari Extra" w:cs="BRH Devanagari Extra"/>
-                <w:color w:val="000000"/>
-                <w:sz w:val="32"/>
-                <w:szCs w:val="40"/>
-                <w:lang w:val="it-IT"/>
-              </w:rPr>
-              <w:t>)-  L</w:t>
-            </w:r>
-            <w:r>
-              <w:rPr>
-                <w:rFonts w:ascii="BRH Devanagari Extra" w:hAnsi="BRH Devanagari Extra" w:cs="BRH Devanagari Extra"/>
-                <w:color w:val="000000"/>
-                <w:sz w:val="32"/>
-                <w:szCs w:val="40"/>
-                <w:highlight w:val="green"/>
-                <w:lang w:val="it-IT"/>
-              </w:rPr>
-              <w:t>irÉ</w:t>
-            </w:r>
-            <w:r>
-              <w:rPr>
-                <w:rFonts w:ascii="BRH Devanagari Extra" w:hAnsi="BRH Devanagari Extra" w:cs="BRH Devanagari Extra"/>
-                <w:color w:val="000000"/>
-                <w:sz w:val="32"/>
-                <w:szCs w:val="40"/>
-                <w:lang w:val="it-IT"/>
-              </w:rPr>
-              <w:t>þ |</w:t>
-            </w:r>
-          </w:p>
-          <w:p>
-            <w:pPr>
-              <w:widowControl w:val="0"/>
-              <w:autoSpaceDE w:val="0"/>
-              <w:autoSpaceDN w:val="0"/>
-              <w:adjustRightInd w:val="0"/>
-              <w:spacing w:before="0" w:line="240" w:lineRule="auto"/>
-              <w:rPr>
-                <w:rFonts w:cs="Latha"/>
-                <w:b/>
-                <w:bCs/>
-                <w:szCs w:val="24"/>
-                <w:cs/>
-                <w:lang w:val="it-IT" w:bidi="ta-IN"/>
-              </w:rPr>
-            </w:pPr>
-            <w:r>
-              <w:rPr>
-                <w:rFonts w:ascii="BRH Devanagari Extra" w:hAnsi="BRH Devanagari Extra" w:cs="BRH Devanagari Extra"/>
-                <w:color w:val="000000"/>
-                <w:sz w:val="32"/>
-                <w:szCs w:val="40"/>
-                <w:lang w:val="it-IT"/>
-              </w:rPr>
-              <w:t xml:space="preserve">LirÉåirÉÉÿ - CirÉþ | </w:t>
-            </w:r>
-          </w:p>
-        </w:tc>
-      </w:tr>
-      <w:tr>
-        <w:trPr>
-          <w:trHeight w:val="1405"/>
-        </w:trPr>
-        <w:tc>
-          <w:tcPr>
-            <w:tcW w:w="7166" w:type="dxa"/>
-          </w:tcPr>
-          <w:p>
-            <w:pPr>
-              <w:widowControl w:val="0"/>
-              <w:autoSpaceDE w:val="0"/>
-              <w:autoSpaceDN w:val="0"/>
-              <w:adjustRightInd w:val="0"/>
-              <w:spacing w:before="0" w:line="240" w:lineRule="auto"/>
-              <w:rPr>
-                <w:rFonts w:ascii="BRH Devanagari Extra" w:hAnsi="BRH Devanagari Extra" w:cs="BRH Devanagari Extra"/>
-                <w:color w:val="000000"/>
-                <w:sz w:val="32"/>
-                <w:szCs w:val="40"/>
-              </w:rPr>
-            </w:pPr>
-            <w:r>
-              <w:rPr>
-                <w:rFonts w:cs="BRH Devanagari Extra"/>
-                <w:color w:val="000000"/>
-                <w:szCs w:val="40"/>
-              </w:rPr>
-              <w:t>65</w:t>
-            </w:r>
-            <w:r>
-              <w:rPr>
-                <w:rFonts w:ascii="BRH Devanagari Extra" w:hAnsi="BRH Devanagari Extra" w:cs="BRH Devanagari Extra"/>
-                <w:color w:val="000000"/>
-                <w:sz w:val="32"/>
-                <w:szCs w:val="40"/>
-              </w:rPr>
-              <w:t>)</w:t>
-            </w:r>
-            <w:r>
-              <w:rPr>
-                <w:rFonts w:ascii="BRH Devanagari Extra" w:hAnsi="BRH Devanagari Extra" w:cs="BRH Devanagari Extra"/>
-                <w:color w:val="000000"/>
-                <w:sz w:val="32"/>
-                <w:szCs w:val="40"/>
-              </w:rPr>
-              <w:tab/>
-            </w:r>
-            <w:r>
-              <w:rPr>
-                <w:rFonts w:cs="BRH Devanagari Extra"/>
-                <w:color w:val="000000"/>
-                <w:szCs w:val="40"/>
-              </w:rPr>
-              <w:t>2</w:t>
-            </w:r>
-            <w:r>
-              <w:rPr>
-                <w:rFonts w:ascii="BRH Devanagari Extra" w:hAnsi="BRH Devanagari Extra" w:cs="BRH Devanagari Extra"/>
-                <w:color w:val="000000"/>
-                <w:sz w:val="32"/>
-                <w:szCs w:val="40"/>
-              </w:rPr>
-              <w:t>.</w:t>
-            </w:r>
-            <w:r>
-              <w:rPr>
-                <w:rFonts w:cs="BRH Devanagari Extra"/>
-                <w:color w:val="000000"/>
-                <w:szCs w:val="40"/>
-              </w:rPr>
-              <w:t>3</w:t>
-            </w:r>
-            <w:r>
-              <w:rPr>
-                <w:rFonts w:ascii="BRH Devanagari Extra" w:hAnsi="BRH Devanagari Extra" w:cs="BRH Devanagari Extra"/>
-                <w:color w:val="000000"/>
-                <w:sz w:val="32"/>
-                <w:szCs w:val="40"/>
-              </w:rPr>
-              <w:t>.</w:t>
-            </w:r>
-            <w:r>
-              <w:rPr>
-                <w:rFonts w:cs="BRH Devanagari Extra"/>
-                <w:color w:val="000000"/>
-                <w:szCs w:val="40"/>
-              </w:rPr>
-              <w:t>5</w:t>
-            </w:r>
-            <w:r>
-              <w:rPr>
-                <w:rFonts w:ascii="BRH Devanagari Extra" w:hAnsi="BRH Devanagari Extra" w:cs="BRH Devanagari Extra"/>
-                <w:color w:val="000000"/>
-                <w:sz w:val="32"/>
-                <w:szCs w:val="40"/>
-              </w:rPr>
-              <w:t>.</w:t>
-            </w:r>
-            <w:r>
-              <w:rPr>
-                <w:rFonts w:cs="BRH Devanagari Extra"/>
-                <w:color w:val="000000"/>
-                <w:szCs w:val="40"/>
-              </w:rPr>
-              <w:t>3</w:t>
-            </w:r>
-            <w:r>
-              <w:rPr>
-                <w:rFonts w:ascii="BRH Devanagari Extra" w:hAnsi="BRH Devanagari Extra" w:cs="BRH Devanagari Extra"/>
-                <w:color w:val="000000"/>
-                <w:sz w:val="32"/>
-                <w:szCs w:val="40"/>
-              </w:rPr>
-              <w:t>(</w:t>
-            </w:r>
-            <w:r>
-              <w:rPr>
-                <w:rFonts w:cs="BRH Devanagari Extra"/>
-                <w:color w:val="000000"/>
-                <w:szCs w:val="40"/>
-              </w:rPr>
-              <w:t>58</w:t>
-            </w:r>
-            <w:r>
-              <w:rPr>
-                <w:rFonts w:ascii="BRH Devanagari Extra" w:hAnsi="BRH Devanagari Extra" w:cs="BRH Devanagari Extra"/>
-                <w:color w:val="000000"/>
-                <w:sz w:val="32"/>
-                <w:szCs w:val="40"/>
-              </w:rPr>
-              <w:t>)-  rÉÉ</w:t>
-            </w:r>
-            <w:r>
-              <w:rPr>
-                <w:rFonts w:ascii="BRH Malayalam Extra" w:hAnsi="BRH Malayalam Extra" w:cs="BRH Devanagari Extra"/>
-                <w:color w:val="000000"/>
-                <w:szCs w:val="40"/>
-              </w:rPr>
-              <w:t>–</w:t>
-            </w:r>
-            <w:r>
-              <w:rPr>
-                <w:rFonts w:ascii="BRH Devanagari Extra" w:hAnsi="BRH Devanagari Extra" w:cs="BRH Devanagari Extra"/>
-                <w:color w:val="000000"/>
-                <w:sz w:val="32"/>
-                <w:szCs w:val="40"/>
-              </w:rPr>
-              <w:t xml:space="preserve">erÉÉÿ | AÉ | </w:t>
-            </w:r>
-          </w:p>
-          <w:p>
-            <w:pPr>
-              <w:widowControl w:val="0"/>
-              <w:autoSpaceDE w:val="0"/>
-              <w:autoSpaceDN w:val="0"/>
-              <w:adjustRightInd w:val="0"/>
-              <w:spacing w:before="0" w:line="240" w:lineRule="auto"/>
-              <w:rPr>
-                <w:rFonts w:cs="BRH Malayalam Extra"/>
-                <w:color w:val="000000"/>
-                <w:szCs w:val="40"/>
-              </w:rPr>
-            </w:pPr>
-            <w:r>
-              <w:rPr>
-                <w:rFonts w:ascii="BRH Devanagari Extra" w:hAnsi="BRH Devanagari Extra" w:cs="BRH Devanagari Extra"/>
-                <w:color w:val="000000"/>
-                <w:sz w:val="32"/>
-                <w:szCs w:val="40"/>
-              </w:rPr>
-              <w:t>rÉÉ</w:t>
-            </w:r>
-            <w:r>
-              <w:rPr>
-                <w:rFonts w:ascii="BRH Malayalam Extra" w:hAnsi="BRH Malayalam Extra" w:cs="BRH Devanagari Extra"/>
-                <w:color w:val="000000"/>
-                <w:szCs w:val="40"/>
-              </w:rPr>
-              <w:t>–</w:t>
-            </w:r>
-            <w:r>
-              <w:rPr>
-                <w:rFonts w:ascii="BRH Devanagari Extra" w:hAnsi="BRH Devanagari Extra" w:cs="BRH Devanagari Extra"/>
-                <w:color w:val="000000"/>
-                <w:sz w:val="32"/>
-                <w:szCs w:val="40"/>
-                <w:highlight w:val="yellow"/>
-              </w:rPr>
-              <w:t>erÉÉ</w:t>
-            </w:r>
-            <w:r>
-              <w:rPr>
-                <w:rFonts w:ascii="BRH Devanagari Extra" w:hAnsi="BRH Devanagari Extra" w:cs="BRH Devanagari Extra"/>
-                <w:color w:val="000000"/>
-                <w:sz w:val="32"/>
-                <w:szCs w:val="40"/>
-              </w:rPr>
-              <w:t>þ ÅÅrÉÉ</w:t>
-            </w:r>
-            <w:r>
-              <w:rPr>
-                <w:rFonts w:ascii="BRH Malayalam Extra" w:hAnsi="BRH Malayalam Extra" w:cs="BRH Devanagari Extra"/>
-                <w:color w:val="000000"/>
-                <w:szCs w:val="40"/>
-              </w:rPr>
-              <w:t>–</w:t>
-            </w:r>
-            <w:r>
-              <w:rPr>
-                <w:rFonts w:ascii="BRH Devanagari Extra" w:hAnsi="BRH Devanagari Extra" w:cs="BRH Devanagari Extra"/>
-                <w:color w:val="000000"/>
-                <w:sz w:val="32"/>
-                <w:szCs w:val="40"/>
-              </w:rPr>
-              <w:t>erÉÉþ rÉÉ</w:t>
-            </w:r>
-            <w:r>
-              <w:rPr>
-                <w:rFonts w:ascii="BRH Malayalam Extra" w:hAnsi="BRH Malayalam Extra" w:cs="BRH Devanagari Extra"/>
-                <w:color w:val="000000"/>
-                <w:szCs w:val="40"/>
-                <w:highlight w:val="yellow"/>
-              </w:rPr>
-              <w:t>–</w:t>
-            </w:r>
-            <w:r>
-              <w:rPr>
-                <w:rFonts w:ascii="BRH Devanagari Extra" w:hAnsi="BRH Devanagari Extra" w:cs="BRH Devanagari Extra"/>
-                <w:color w:val="000000"/>
-                <w:sz w:val="32"/>
-                <w:szCs w:val="40"/>
-                <w:highlight w:val="yellow"/>
-              </w:rPr>
-              <w:t>erÉÉÿ</w:t>
-            </w:r>
-            <w:r>
-              <w:rPr>
-                <w:rFonts w:ascii="BRH Devanagari Extra" w:hAnsi="BRH Devanagari Extra" w:cs="BRH Devanagari Extra"/>
-                <w:color w:val="000000"/>
-                <w:sz w:val="32"/>
-                <w:szCs w:val="40"/>
-              </w:rPr>
-              <w:t xml:space="preserve"> | </w:t>
-            </w:r>
-          </w:p>
-        </w:tc>
-        <w:tc>
-          <w:tcPr>
-            <w:tcW w:w="7371" w:type="dxa"/>
-          </w:tcPr>
-          <w:p>
-            <w:pPr>
-              <w:widowControl w:val="0"/>
-              <w:autoSpaceDE w:val="0"/>
-              <w:autoSpaceDN w:val="0"/>
-              <w:adjustRightInd w:val="0"/>
-              <w:spacing w:before="0" w:line="240" w:lineRule="auto"/>
-              <w:rPr>
-                <w:rFonts w:ascii="BRH Devanagari Extra" w:hAnsi="BRH Devanagari Extra" w:cs="BRH Devanagari Extra"/>
-                <w:color w:val="000000"/>
-                <w:sz w:val="32"/>
-                <w:szCs w:val="40"/>
-              </w:rPr>
-            </w:pPr>
-            <w:r>
-              <w:rPr>
-                <w:rFonts w:cs="BRH Devanagari Extra"/>
-                <w:color w:val="000000"/>
-                <w:szCs w:val="40"/>
-              </w:rPr>
-              <w:t>65</w:t>
-            </w:r>
-            <w:r>
-              <w:rPr>
-                <w:rFonts w:ascii="BRH Devanagari Extra" w:hAnsi="BRH Devanagari Extra" w:cs="BRH Devanagari Extra"/>
-                <w:color w:val="000000"/>
-                <w:sz w:val="32"/>
-                <w:szCs w:val="40"/>
-              </w:rPr>
-              <w:t>)</w:t>
-            </w:r>
-            <w:r>
-              <w:rPr>
-                <w:rFonts w:ascii="BRH Devanagari Extra" w:hAnsi="BRH Devanagari Extra" w:cs="BRH Devanagari Extra"/>
-                <w:color w:val="000000"/>
-                <w:sz w:val="32"/>
-                <w:szCs w:val="40"/>
-              </w:rPr>
-              <w:tab/>
-            </w:r>
-            <w:r>
-              <w:rPr>
-                <w:rFonts w:cs="BRH Devanagari Extra"/>
-                <w:color w:val="000000"/>
-                <w:szCs w:val="40"/>
-              </w:rPr>
-              <w:t>2</w:t>
-            </w:r>
-            <w:r>
-              <w:rPr>
-                <w:rFonts w:ascii="BRH Devanagari Extra" w:hAnsi="BRH Devanagari Extra" w:cs="BRH Devanagari Extra"/>
-                <w:color w:val="000000"/>
-                <w:sz w:val="32"/>
-                <w:szCs w:val="40"/>
-              </w:rPr>
-              <w:t>.</w:t>
-            </w:r>
-            <w:r>
-              <w:rPr>
-                <w:rFonts w:cs="BRH Devanagari Extra"/>
-                <w:color w:val="000000"/>
-                <w:szCs w:val="40"/>
-              </w:rPr>
-              <w:t>3</w:t>
-            </w:r>
-            <w:r>
-              <w:rPr>
-                <w:rFonts w:ascii="BRH Devanagari Extra" w:hAnsi="BRH Devanagari Extra" w:cs="BRH Devanagari Extra"/>
-                <w:color w:val="000000"/>
-                <w:sz w:val="32"/>
-                <w:szCs w:val="40"/>
-              </w:rPr>
-              <w:t>.</w:t>
-            </w:r>
-            <w:r>
-              <w:rPr>
-                <w:rFonts w:cs="BRH Devanagari Extra"/>
-                <w:color w:val="000000"/>
-                <w:szCs w:val="40"/>
-              </w:rPr>
-              <w:t>5</w:t>
-            </w:r>
-            <w:r>
-              <w:rPr>
-                <w:rFonts w:ascii="BRH Devanagari Extra" w:hAnsi="BRH Devanagari Extra" w:cs="BRH Devanagari Extra"/>
-                <w:color w:val="000000"/>
-                <w:sz w:val="32"/>
-                <w:szCs w:val="40"/>
-              </w:rPr>
-              <w:t>.</w:t>
-            </w:r>
-            <w:r>
-              <w:rPr>
-                <w:rFonts w:cs="BRH Devanagari Extra"/>
-                <w:color w:val="000000"/>
-                <w:szCs w:val="40"/>
-              </w:rPr>
-              <w:t>3</w:t>
-            </w:r>
-            <w:r>
-              <w:rPr>
-                <w:rFonts w:ascii="BRH Devanagari Extra" w:hAnsi="BRH Devanagari Extra" w:cs="BRH Devanagari Extra"/>
-                <w:color w:val="000000"/>
-                <w:sz w:val="32"/>
-                <w:szCs w:val="40"/>
-              </w:rPr>
-              <w:t>(</w:t>
-            </w:r>
-            <w:r>
-              <w:rPr>
-                <w:rFonts w:cs="BRH Devanagari Extra"/>
-                <w:color w:val="000000"/>
-                <w:szCs w:val="40"/>
-              </w:rPr>
-              <w:t>58</w:t>
-            </w:r>
-            <w:r>
-              <w:rPr>
-                <w:rFonts w:ascii="BRH Devanagari Extra" w:hAnsi="BRH Devanagari Extra" w:cs="BRH Devanagari Extra"/>
-                <w:color w:val="000000"/>
-                <w:sz w:val="32"/>
-                <w:szCs w:val="40"/>
-              </w:rPr>
-              <w:t>)-  rÉÉ</w:t>
-            </w:r>
-            <w:r>
-              <w:rPr>
-                <w:rFonts w:ascii="BRH Malayalam Extra" w:hAnsi="BRH Malayalam Extra" w:cs="BRH Devanagari Extra"/>
-                <w:color w:val="000000"/>
-                <w:szCs w:val="40"/>
-              </w:rPr>
-              <w:t>–</w:t>
-            </w:r>
-            <w:r>
-              <w:rPr>
-                <w:rFonts w:ascii="BRH Devanagari Extra" w:hAnsi="BRH Devanagari Extra" w:cs="BRH Devanagari Extra"/>
-                <w:color w:val="000000"/>
-                <w:sz w:val="32"/>
-                <w:szCs w:val="40"/>
-              </w:rPr>
-              <w:t xml:space="preserve">erÉÉÿ | AÉ | </w:t>
-            </w:r>
-          </w:p>
-          <w:p>
-            <w:pPr>
-              <w:widowControl w:val="0"/>
-              <w:autoSpaceDE w:val="0"/>
-              <w:autoSpaceDN w:val="0"/>
-              <w:adjustRightInd w:val="0"/>
-              <w:spacing w:before="0" w:line="240" w:lineRule="auto"/>
-              <w:rPr>
-                <w:rFonts w:cs="BRH Malayalam Extra"/>
-                <w:color w:val="000000"/>
-                <w:szCs w:val="40"/>
-              </w:rPr>
-            </w:pPr>
-            <w:r>
-              <w:rPr>
-                <w:rFonts w:ascii="BRH Devanagari Extra" w:hAnsi="BRH Devanagari Extra" w:cs="BRH Devanagari Extra"/>
-                <w:color w:val="000000"/>
-                <w:sz w:val="32"/>
-                <w:szCs w:val="40"/>
-              </w:rPr>
-              <w:t>rÉÉ</w:t>
-            </w:r>
-            <w:r>
-              <w:rPr>
-                <w:rFonts w:ascii="BRH Malayalam Extra" w:hAnsi="BRH Malayalam Extra" w:cs="BRH Devanagari Extra"/>
-                <w:color w:val="000000"/>
-                <w:szCs w:val="40"/>
-              </w:rPr>
-              <w:t>–</w:t>
-            </w:r>
-            <w:r>
-              <w:rPr>
-                <w:rFonts w:ascii="BRH Devanagari Extra" w:hAnsi="BRH Devanagari Extra" w:cs="BRH Devanagari Extra"/>
-                <w:color w:val="000000"/>
-                <w:sz w:val="32"/>
-                <w:szCs w:val="40"/>
-                <w:highlight w:val="green"/>
-              </w:rPr>
-              <w:t>erÉÉ</w:t>
-            </w:r>
-            <w:r>
-              <w:rPr>
-                <w:rFonts w:ascii="BRH Devanagari Extra" w:hAnsi="BRH Devanagari Extra" w:cs="BRH Devanagari Extra"/>
-                <w:color w:val="000000"/>
-                <w:sz w:val="32"/>
-                <w:szCs w:val="40"/>
-              </w:rPr>
-              <w:t xml:space="preserve"> ÅÅrÉÉ</w:t>
-            </w:r>
-            <w:r>
-              <w:rPr>
-                <w:rFonts w:ascii="BRH Malayalam Extra" w:hAnsi="BRH Malayalam Extra" w:cs="BRH Devanagari Extra"/>
-                <w:color w:val="000000"/>
-                <w:szCs w:val="40"/>
-              </w:rPr>
-              <w:t>–</w:t>
-            </w:r>
-            <w:r>
-              <w:rPr>
-                <w:rFonts w:ascii="BRH Devanagari Extra" w:hAnsi="BRH Devanagari Extra" w:cs="BRH Devanagari Extra"/>
-                <w:color w:val="000000"/>
-                <w:sz w:val="32"/>
-                <w:szCs w:val="40"/>
-              </w:rPr>
-              <w:t>erÉÉþ rÉÉ</w:t>
-            </w:r>
-            <w:r>
-              <w:rPr>
-                <w:rFonts w:ascii="BRH Malayalam Extra" w:hAnsi="BRH Malayalam Extra" w:cs="BRH Devanagari Extra"/>
-                <w:color w:val="000000"/>
-                <w:szCs w:val="40"/>
-                <w:highlight w:val="yellow"/>
-              </w:rPr>
-              <w:t>–</w:t>
-            </w:r>
-            <w:r>
-              <w:rPr>
-                <w:rFonts w:ascii="BRH Devanagari Extra" w:hAnsi="BRH Devanagari Extra" w:cs="BRH Devanagari Extra"/>
-                <w:color w:val="000000"/>
-                <w:sz w:val="32"/>
-                <w:szCs w:val="40"/>
-                <w:highlight w:val="green"/>
-              </w:rPr>
-              <w:t>erÉÉ</w:t>
-            </w:r>
-            <w:r>
-              <w:rPr>
-                <w:rFonts w:ascii="BRH Devanagari Extra" w:hAnsi="BRH Devanagari Extra" w:cs="BRH Devanagari Extra"/>
-                <w:color w:val="000000"/>
-                <w:sz w:val="32"/>
-                <w:szCs w:val="40"/>
-              </w:rPr>
-              <w:t xml:space="preserve"> | </w:t>
+                <w:rFonts w:ascii="Latha" w:hAnsi="Latha" w:cs="Latha"/>
+                <w:szCs w:val="24"/>
+                <w:cs/>
+                <w:lang w:bidi="ta-IN"/>
+              </w:rPr>
+              <w:t>ஏத்யேத்யா</w:t>
+            </w:r>
+            <w:r>
+              <w:rPr>
+                <w:rFonts w:ascii="BRH Tamil Tab Extra" w:hAnsi="BRH Tamil Tab Extra" w:cs="Latha"/>
+                <w:b/>
+                <w:bCs/>
+                <w:szCs w:val="28"/>
+                <w:lang w:bidi="ta-IN"/>
+              </w:rPr>
+              <w:t>‡</w:t>
+            </w:r>
+            <w:r>
+              <w:rPr>
+                <w:rFonts w:ascii="Latha" w:hAnsi="Latha" w:cs="Latha"/>
+                <w:szCs w:val="24"/>
+                <w:lang w:bidi="ta-IN"/>
+              </w:rPr>
+              <w:t xml:space="preserve"> - </w:t>
+            </w:r>
+            <w:r>
+              <w:rPr>
+                <w:rFonts w:ascii="Latha" w:hAnsi="Latha" w:cs="Latha"/>
+                <w:szCs w:val="24"/>
+                <w:cs/>
+                <w:lang w:bidi="ta-IN"/>
+              </w:rPr>
+              <w:t>இத்ய</w:t>
+            </w:r>
+            <w:r>
+              <w:rPr>
+                <w:rFonts w:ascii="BRH Tamil Tab Extra" w:hAnsi="BRH Tamil Tab Extra" w:cs="Latha"/>
+                <w:b/>
+                <w:bCs/>
+                <w:szCs w:val="28"/>
+                <w:lang w:bidi="ta-IN"/>
+              </w:rPr>
+              <w:t>†</w:t>
+            </w:r>
+            <w:r>
+              <w:rPr>
+                <w:rFonts w:ascii="Latha" w:hAnsi="Latha" w:cs="Latha"/>
+                <w:szCs w:val="24"/>
+                <w:lang w:bidi="ta-IN"/>
+              </w:rPr>
+              <w:t xml:space="preserve"> |</w:t>
             </w:r>
           </w:p>
         </w:tc>
       </w:tr>
     </w:tbl>
+    <w:p>
+      <w:pPr>
+        <w:spacing w:before="0" w:line="240" w:lineRule="auto"/>
+        <w:jc w:val="center"/>
+        <w:rPr>
+          <w:b/>
+          <w:bCs/>
+          <w:sz w:val="32"/>
+          <w:szCs w:val="32"/>
+          <w:u w:val="single"/>
+        </w:rPr>
+      </w:pPr>
+    </w:p>
+    <w:p>
+      <w:pPr>
+        <w:spacing w:before="0" w:line="240" w:lineRule="auto"/>
+        <w:jc w:val="center"/>
+        <w:rPr>
+          <w:b/>
+          <w:bCs/>
+          <w:sz w:val="32"/>
+          <w:szCs w:val="32"/>
+          <w:u w:val="single"/>
+        </w:rPr>
+      </w:pPr>
+    </w:p>
+    <w:p>
+      <w:pPr>
+        <w:spacing w:before="0" w:line="240" w:lineRule="auto"/>
+        <w:jc w:val="center"/>
+        <w:rPr>
+          <w:b/>
+          <w:bCs/>
+          <w:sz w:val="32"/>
+          <w:szCs w:val="32"/>
+          <w:u w:val="single"/>
+        </w:rPr>
+      </w:pPr>
+    </w:p>
+    <w:p>
+      <w:pPr>
+        <w:spacing w:before="0" w:line="240" w:lineRule="auto"/>
+        <w:jc w:val="center"/>
+        <w:rPr>
+          <w:b/>
+          <w:bCs/>
+          <w:sz w:val="32"/>
+          <w:szCs w:val="32"/>
+          <w:u w:val="single"/>
+        </w:rPr>
+      </w:pPr>
+    </w:p>
     <w:p>
       <w:pPr>
         <w:spacing w:before="0" w:line="240" w:lineRule="auto"/>
@@ -2120,6 +2954,7 @@
           <w:szCs w:val="32"/>
           <w:u w:val="single"/>
         </w:rPr>
+        <w:lastRenderedPageBreak/>
         <w:t xml:space="preserve">TS </w:t>
       </w:r>
       <w:r>
@@ -2329,7 +3164,6 @@
                 <w:cs/>
                 <w:lang w:bidi="ta-IN"/>
               </w:rPr>
-              <w:lastRenderedPageBreak/>
               <w:t>1</w:t>
             </w:r>
             <w:r>
@@ -10457,7 +11291,6 @@
                 <w:cs/>
                 <w:lang w:bidi="ta-IN"/>
               </w:rPr>
-              <w:lastRenderedPageBreak/>
               <w:t>27)</w:t>
             </w:r>
             <w:r>
@@ -13124,6 +13957,7 @@
                 <w:cs/>
                 <w:lang w:bidi="ta-IN"/>
               </w:rPr>
+              <w:lastRenderedPageBreak/>
               <w:t>16</w:t>
             </w:r>
             <w:r>
@@ -15937,7 +16771,6 @@
                 <w:cs/>
                 <w:lang w:bidi="ta-IN"/>
               </w:rPr>
-              <w:lastRenderedPageBreak/>
               <w:t>32</w:t>
             </w:r>
             <w:r>
@@ -18357,7 +19190,7 @@
   <w:style w:type="paragraph" w:default="1" w:styleId="Normal">
     <w:name w:val="Normal"/>
     <w:qFormat/>
-    <w:rsid w:val="00076C05"/>
+    <w:rsid w:val="002106CD"/>
     <w:pPr>
       <w:spacing w:before="120" w:line="276" w:lineRule="auto"/>
     </w:pPr>

</xml_diff>